<commit_message>
SA 54321: requirements doc v1.1 after review - Rule 5 (location 281), wording-sample appendix, test cases
Mark's review of the 10/10 draft. Added Rule 5 (orders whose source location is 281 are left alone), dropped the
2026 results section, and replaced the IT-only technical appendix with a reviewer-facing sample of unsuitable
words/phrases because the technical text was useless to reviewers (it moved verbatim to SA-54321-Technical-Reference.md).
Test emails now go to internal users only; test case 9 (marketing message) dropped at Mark's request; new case 10 is
test user Island2 with default location 281. Layout fixed: screenshot sized to the template's 5.5in body column,
real bullets, no orphan table row. Nothing built or deployed; Island2 test not yet run, Play tester not yet named.
Wording list is a judgement sample, not checked against 2026 data.

Co-Authored-By: Claude Sonnet 5.5 <noreply@anthropic.com>
</commit_message>
<xml_diff>
--- a/Docs/SA-54321-Order-Ack-Subject-Requirements-v1.0.docx
+++ b/Docs/SA-54321-Order-Ack-Subject-Requirements-v1.0.docx
@@ -99,7 +99,7 @@
         <w:t xml:space="preserve">Last Updated: </w:t>
       </w:r>
       <w:r>
-        <w:t>September 27, 2026</w:t>
+        <w:t>October 13, 2026</w:t>
       </w:r>
     </w:p>
     <w:p>
@@ -113,7 +113,7 @@
         <w:t xml:space="preserve">Version: </w:t>
       </w:r>
       <w:r>
-        <w:t>1.0</w:t>
+        <w:t>1.1</w:t>
       </w:r>
     </w:p>
     <w:p>
@@ -165,7 +165,7 @@
       <w:r>
         <w:fldChar w:fldCharType="separate"/>
       </w:r>
-      <w:hyperlink w:anchor="_Toc241743583" w:history="1">
+      <w:hyperlink w:anchor="_Toc242784025" w:history="1">
         <w:r>
           <w:rPr>
             <w:rStyle w:val="Hyperlink"/>
@@ -192,7 +192,7 @@
             <w:noProof/>
             <w:webHidden/>
           </w:rPr>
-          <w:instrText xml:space="preserve"> PAGEREF _Toc241743583 \h </w:instrText>
+          <w:instrText xml:space="preserve"> PAGEREF _Toc242784025 \h </w:instrText>
         </w:r>
         <w:r>
           <w:rPr>
@@ -235,7 +235,7 @@
           <w14:ligatures w14:val="standardContextual"/>
         </w:rPr>
       </w:pPr>
-      <w:hyperlink w:anchor="_Toc241743584" w:history="1">
+      <w:hyperlink w:anchor="_Toc242784026" w:history="1">
         <w:r>
           <w:rPr>
             <w:rStyle w:val="Hyperlink"/>
@@ -262,7 +262,7 @@
             <w:noProof/>
             <w:webHidden/>
           </w:rPr>
-          <w:instrText xml:space="preserve"> PAGEREF _Toc241743584 \h </w:instrText>
+          <w:instrText xml:space="preserve"> PAGEREF _Toc242784026 \h </w:instrText>
         </w:r>
         <w:r>
           <w:rPr>
@@ -305,7 +305,7 @@
           <w14:ligatures w14:val="standardContextual"/>
         </w:rPr>
       </w:pPr>
-      <w:hyperlink w:anchor="_Toc241743585" w:history="1">
+      <w:hyperlink w:anchor="_Toc242784027" w:history="1">
         <w:r>
           <w:rPr>
             <w:rStyle w:val="Hyperlink"/>
@@ -332,7 +332,7 @@
             <w:noProof/>
             <w:webHidden/>
           </w:rPr>
-          <w:instrText xml:space="preserve"> PAGEREF _Toc241743585 \h </w:instrText>
+          <w:instrText xml:space="preserve"> PAGEREF _Toc242784027 \h </w:instrText>
         </w:r>
         <w:r>
           <w:rPr>
@@ -375,7 +375,7 @@
           <w14:ligatures w14:val="standardContextual"/>
         </w:rPr>
       </w:pPr>
-      <w:hyperlink w:anchor="_Toc241743586" w:history="1">
+      <w:hyperlink w:anchor="_Toc242784028" w:history="1">
         <w:r>
           <w:rPr>
             <w:rStyle w:val="Hyperlink"/>
@@ -402,7 +402,7 @@
             <w:noProof/>
             <w:webHidden/>
           </w:rPr>
-          <w:instrText xml:space="preserve"> PAGEREF _Toc241743586 \h </w:instrText>
+          <w:instrText xml:space="preserve"> PAGEREF _Toc242784028 \h </w:instrText>
         </w:r>
         <w:r>
           <w:rPr>
@@ -445,7 +445,7 @@
           <w14:ligatures w14:val="standardContextual"/>
         </w:rPr>
       </w:pPr>
-      <w:hyperlink w:anchor="_Toc241743587" w:history="1">
+      <w:hyperlink w:anchor="_Toc242784029" w:history="1">
         <w:r>
           <w:rPr>
             <w:rStyle w:val="Hyperlink"/>
@@ -472,7 +472,7 @@
             <w:noProof/>
             <w:webHidden/>
           </w:rPr>
-          <w:instrText xml:space="preserve"> PAGEREF _Toc241743587 \h </w:instrText>
+          <w:instrText xml:space="preserve"> PAGEREF _Toc242784029 \h </w:instrText>
         </w:r>
         <w:r>
           <w:rPr>
@@ -515,7 +515,7 @@
           <w14:ligatures w14:val="standardContextual"/>
         </w:rPr>
       </w:pPr>
-      <w:hyperlink w:anchor="_Toc241743588" w:history="1">
+      <w:hyperlink w:anchor="_Toc242784030" w:history="1">
         <w:r>
           <w:rPr>
             <w:rStyle w:val="Hyperlink"/>
@@ -542,7 +542,7 @@
             <w:noProof/>
             <w:webHidden/>
           </w:rPr>
-          <w:instrText xml:space="preserve"> PAGEREF _Toc241743588 \h </w:instrText>
+          <w:instrText xml:space="preserve"> PAGEREF _Toc242784030 \h </w:instrText>
         </w:r>
         <w:r>
           <w:rPr>
@@ -585,7 +585,7 @@
           <w14:ligatures w14:val="standardContextual"/>
         </w:rPr>
       </w:pPr>
-      <w:hyperlink w:anchor="_Toc241743589" w:history="1">
+      <w:hyperlink w:anchor="_Toc242784031" w:history="1">
         <w:r>
           <w:rPr>
             <w:rStyle w:val="Hyperlink"/>
@@ -612,7 +612,7 @@
             <w:noProof/>
             <w:webHidden/>
           </w:rPr>
-          <w:instrText xml:space="preserve"> PAGEREF _Toc241743589 \h </w:instrText>
+          <w:instrText xml:space="preserve"> PAGEREF _Toc242784031 \h </w:instrText>
         </w:r>
         <w:r>
           <w:rPr>
@@ -655,7 +655,7 @@
           <w14:ligatures w14:val="standardContextual"/>
         </w:rPr>
       </w:pPr>
-      <w:hyperlink w:anchor="_Toc241743590" w:history="1">
+      <w:hyperlink w:anchor="_Toc242784032" w:history="1">
         <w:r>
           <w:rPr>
             <w:rStyle w:val="Hyperlink"/>
@@ -682,7 +682,7 @@
             <w:noProof/>
             <w:webHidden/>
           </w:rPr>
-          <w:instrText xml:space="preserve"> PAGEREF _Toc241743590 \h </w:instrText>
+          <w:instrText xml:space="preserve"> PAGEREF _Toc242784032 \h </w:instrText>
         </w:r>
         <w:r>
           <w:rPr>
@@ -725,7 +725,7 @@
           <w14:ligatures w14:val="standardContextual"/>
         </w:rPr>
       </w:pPr>
-      <w:hyperlink w:anchor="_Toc241743591" w:history="1">
+      <w:hyperlink w:anchor="_Toc242784033" w:history="1">
         <w:r>
           <w:rPr>
             <w:rStyle w:val="Hyperlink"/>
@@ -752,7 +752,7 @@
             <w:noProof/>
             <w:webHidden/>
           </w:rPr>
-          <w:instrText xml:space="preserve"> PAGEREF _Toc241743591 \h </w:instrText>
+          <w:instrText xml:space="preserve"> PAGEREF _Toc242784033 \h </w:instrText>
         </w:r>
         <w:r>
           <w:rPr>
@@ -795,7 +795,7 @@
           <w14:ligatures w14:val="standardContextual"/>
         </w:rPr>
       </w:pPr>
-      <w:hyperlink w:anchor="_Toc241743592" w:history="1">
+      <w:hyperlink w:anchor="_Toc242784034" w:history="1">
         <w:r>
           <w:rPr>
             <w:rStyle w:val="Hyperlink"/>
@@ -822,7 +822,7 @@
             <w:noProof/>
             <w:webHidden/>
           </w:rPr>
-          <w:instrText xml:space="preserve"> PAGEREF _Toc241743592 \h </w:instrText>
+          <w:instrText xml:space="preserve"> PAGEREF _Toc242784034 \h </w:instrText>
         </w:r>
         <w:r>
           <w:rPr>
@@ -865,7 +865,7 @@
           <w14:ligatures w14:val="standardContextual"/>
         </w:rPr>
       </w:pPr>
-      <w:hyperlink w:anchor="_Toc241743593" w:history="1">
+      <w:hyperlink w:anchor="_Toc242784035" w:history="1">
         <w:r>
           <w:rPr>
             <w:rStyle w:val="Hyperlink"/>
@@ -892,7 +892,7 @@
             <w:noProof/>
             <w:webHidden/>
           </w:rPr>
-          <w:instrText xml:space="preserve"> PAGEREF _Toc241743593 \h </w:instrText>
+          <w:instrText xml:space="preserve"> PAGEREF _Toc242784035 \h </w:instrText>
         </w:r>
         <w:r>
           <w:rPr>
@@ -912,7 +912,77 @@
             <w:noProof/>
             <w:webHidden/>
           </w:rPr>
-          <w:t>7</w:t>
+          <w:t>8</w:t>
+        </w:r>
+        <w:r>
+          <w:rPr>
+            <w:noProof/>
+            <w:webHidden/>
+          </w:rPr>
+          <w:fldChar w:fldCharType="end"/>
+        </w:r>
+      </w:hyperlink>
+    </w:p>
+    <w:p>
+      <w:pPr>
+        <w:pStyle w:val="TOC2"/>
+        <w:rPr>
+          <w:rFonts w:asciiTheme="minorHAnsi" w:eastAsiaTheme="minorEastAsia" w:hAnsiTheme="minorHAnsi" w:cstheme="minorBidi"/>
+          <w:noProof/>
+          <w:kern w:val="2"/>
+          <w:sz w:val="24"/>
+          <w:szCs w:val="24"/>
+          <w14:ligatures w14:val="standardContextual"/>
+        </w:rPr>
+      </w:pPr>
+      <w:hyperlink w:anchor="_Toc242784036" w:history="1">
+        <w:r>
+          <w:rPr>
+            <w:rStyle w:val="Hyperlink"/>
+            <w:noProof/>
+          </w:rPr>
+          <w:t>Testing Approach</w:t>
+        </w:r>
+        <w:r>
+          <w:rPr>
+            <w:noProof/>
+            <w:webHidden/>
+          </w:rPr>
+          <w:tab/>
+        </w:r>
+        <w:r>
+          <w:rPr>
+            <w:noProof/>
+            <w:webHidden/>
+          </w:rPr>
+          <w:fldChar w:fldCharType="begin"/>
+        </w:r>
+        <w:r>
+          <w:rPr>
+            <w:noProof/>
+            <w:webHidden/>
+          </w:rPr>
+          <w:instrText xml:space="preserve"> PAGEREF _Toc242784036 \h </w:instrText>
+        </w:r>
+        <w:r>
+          <w:rPr>
+            <w:noProof/>
+            <w:webHidden/>
+          </w:rPr>
+        </w:r>
+        <w:r>
+          <w:rPr>
+            <w:noProof/>
+            <w:webHidden/>
+          </w:rPr>
+          <w:fldChar w:fldCharType="separate"/>
+        </w:r>
+        <w:r>
+          <w:rPr>
+            <w:noProof/>
+            <w:webHidden/>
+          </w:rPr>
+          <w:t>9</w:t>
         </w:r>
         <w:r>
           <w:rPr>
@@ -935,13 +1005,13 @@
           <w14:ligatures w14:val="standardContextual"/>
         </w:rPr>
       </w:pPr>
-      <w:hyperlink w:anchor="_Toc241743594" w:history="1">
+      <w:hyperlink w:anchor="_Toc242784037" w:history="1">
         <w:r>
           <w:rPr>
             <w:rStyle w:val="Hyperlink"/>
             <w:noProof/>
           </w:rPr>
-          <w:t>What this would mean in practice</w:t>
+          <w:t>Environments</w:t>
         </w:r>
         <w:r>
           <w:rPr>
@@ -962,7 +1032,7 @@
             <w:noProof/>
             <w:webHidden/>
           </w:rPr>
-          <w:instrText xml:space="preserve"> PAGEREF _Toc241743594 \h </w:instrText>
+          <w:instrText xml:space="preserve"> PAGEREF _Toc242784037 \h </w:instrText>
         </w:r>
         <w:r>
           <w:rPr>
@@ -982,7 +1052,217 @@
             <w:noProof/>
             <w:webHidden/>
           </w:rPr>
-          <w:t>7</w:t>
+          <w:t>9</w:t>
+        </w:r>
+        <w:r>
+          <w:rPr>
+            <w:noProof/>
+            <w:webHidden/>
+          </w:rPr>
+          <w:fldChar w:fldCharType="end"/>
+        </w:r>
+      </w:hyperlink>
+    </w:p>
+    <w:p>
+      <w:pPr>
+        <w:pStyle w:val="TOC3"/>
+        <w:rPr>
+          <w:rFonts w:asciiTheme="minorHAnsi" w:eastAsiaTheme="minorEastAsia" w:hAnsiTheme="minorHAnsi" w:cstheme="minorBidi"/>
+          <w:noProof/>
+          <w:kern w:val="2"/>
+          <w:sz w:val="24"/>
+          <w:szCs w:val="24"/>
+          <w14:ligatures w14:val="standardContextual"/>
+        </w:rPr>
+      </w:pPr>
+      <w:hyperlink w:anchor="_Toc242784038" w:history="1">
+        <w:r>
+          <w:rPr>
+            <w:rStyle w:val="Hyperlink"/>
+            <w:noProof/>
+          </w:rPr>
+          <w:t>Precautions that apply to both test environments</w:t>
+        </w:r>
+        <w:r>
+          <w:rPr>
+            <w:noProof/>
+            <w:webHidden/>
+          </w:rPr>
+          <w:tab/>
+        </w:r>
+        <w:r>
+          <w:rPr>
+            <w:noProof/>
+            <w:webHidden/>
+          </w:rPr>
+          <w:fldChar w:fldCharType="begin"/>
+        </w:r>
+        <w:r>
+          <w:rPr>
+            <w:noProof/>
+            <w:webHidden/>
+          </w:rPr>
+          <w:instrText xml:space="preserve"> PAGEREF _Toc242784038 \h </w:instrText>
+        </w:r>
+        <w:r>
+          <w:rPr>
+            <w:noProof/>
+            <w:webHidden/>
+          </w:rPr>
+        </w:r>
+        <w:r>
+          <w:rPr>
+            <w:noProof/>
+            <w:webHidden/>
+          </w:rPr>
+          <w:fldChar w:fldCharType="separate"/>
+        </w:r>
+        <w:r>
+          <w:rPr>
+            <w:noProof/>
+            <w:webHidden/>
+          </w:rPr>
+          <w:t>9</w:t>
+        </w:r>
+        <w:r>
+          <w:rPr>
+            <w:noProof/>
+            <w:webHidden/>
+          </w:rPr>
+          <w:fldChar w:fldCharType="end"/>
+        </w:r>
+      </w:hyperlink>
+    </w:p>
+    <w:p>
+      <w:pPr>
+        <w:pStyle w:val="TOC3"/>
+        <w:rPr>
+          <w:rFonts w:asciiTheme="minorHAnsi" w:eastAsiaTheme="minorEastAsia" w:hAnsiTheme="minorHAnsi" w:cstheme="minorBidi"/>
+          <w:noProof/>
+          <w:kern w:val="2"/>
+          <w:sz w:val="24"/>
+          <w:szCs w:val="24"/>
+          <w14:ligatures w14:val="standardContextual"/>
+        </w:rPr>
+      </w:pPr>
+      <w:hyperlink w:anchor="_Toc242784039" w:history="1">
+        <w:r>
+          <w:rPr>
+            <w:rStyle w:val="Hyperlink"/>
+            <w:noProof/>
+          </w:rPr>
+          <w:t>Test Cases</w:t>
+        </w:r>
+        <w:r>
+          <w:rPr>
+            <w:noProof/>
+            <w:webHidden/>
+          </w:rPr>
+          <w:tab/>
+        </w:r>
+        <w:r>
+          <w:rPr>
+            <w:noProof/>
+            <w:webHidden/>
+          </w:rPr>
+          <w:fldChar w:fldCharType="begin"/>
+        </w:r>
+        <w:r>
+          <w:rPr>
+            <w:noProof/>
+            <w:webHidden/>
+          </w:rPr>
+          <w:instrText xml:space="preserve"> PAGEREF _Toc242784039 \h </w:instrText>
+        </w:r>
+        <w:r>
+          <w:rPr>
+            <w:noProof/>
+            <w:webHidden/>
+          </w:rPr>
+        </w:r>
+        <w:r>
+          <w:rPr>
+            <w:noProof/>
+            <w:webHidden/>
+          </w:rPr>
+          <w:fldChar w:fldCharType="separate"/>
+        </w:r>
+        <w:r>
+          <w:rPr>
+            <w:noProof/>
+            <w:webHidden/>
+          </w:rPr>
+          <w:t>10</w:t>
+        </w:r>
+        <w:r>
+          <w:rPr>
+            <w:noProof/>
+            <w:webHidden/>
+          </w:rPr>
+          <w:fldChar w:fldCharType="end"/>
+        </w:r>
+      </w:hyperlink>
+    </w:p>
+    <w:p>
+      <w:pPr>
+        <w:pStyle w:val="TOC3"/>
+        <w:rPr>
+          <w:rFonts w:asciiTheme="minorHAnsi" w:eastAsiaTheme="minorEastAsia" w:hAnsiTheme="minorHAnsi" w:cstheme="minorBidi"/>
+          <w:noProof/>
+          <w:kern w:val="2"/>
+          <w:sz w:val="24"/>
+          <w:szCs w:val="24"/>
+          <w14:ligatures w14:val="standardContextual"/>
+        </w:rPr>
+      </w:pPr>
+      <w:hyperlink w:anchor="_Toc242784040" w:history="1">
+        <w:r>
+          <w:rPr>
+            <w:rStyle w:val="Hyperlink"/>
+            <w:noProof/>
+          </w:rPr>
+          <w:t>What has to be true before go-live</w:t>
+        </w:r>
+        <w:r>
+          <w:rPr>
+            <w:noProof/>
+            <w:webHidden/>
+          </w:rPr>
+          <w:tab/>
+        </w:r>
+        <w:r>
+          <w:rPr>
+            <w:noProof/>
+            <w:webHidden/>
+          </w:rPr>
+          <w:fldChar w:fldCharType="begin"/>
+        </w:r>
+        <w:r>
+          <w:rPr>
+            <w:noProof/>
+            <w:webHidden/>
+          </w:rPr>
+          <w:instrText xml:space="preserve"> PAGEREF _Toc242784040 \h </w:instrText>
+        </w:r>
+        <w:r>
+          <w:rPr>
+            <w:noProof/>
+            <w:webHidden/>
+          </w:rPr>
+        </w:r>
+        <w:r>
+          <w:rPr>
+            <w:noProof/>
+            <w:webHidden/>
+          </w:rPr>
+          <w:fldChar w:fldCharType="separate"/>
+        </w:r>
+        <w:r>
+          <w:rPr>
+            <w:noProof/>
+            <w:webHidden/>
+          </w:rPr>
+          <w:t>10</w:t>
         </w:r>
         <w:r>
           <w:rPr>
@@ -1005,13 +1285,13 @@
           <w14:ligatures w14:val="standardContextual"/>
         </w:rPr>
       </w:pPr>
-      <w:hyperlink w:anchor="_Toc241743595" w:history="1">
+      <w:hyperlink w:anchor="_Toc242784041" w:history="1">
         <w:r>
           <w:rPr>
             <w:rStyle w:val="Hyperlink"/>
             <w:noProof/>
           </w:rPr>
-          <w:t>Testing Approach</w:t>
+          <w:t>Future Features / Updates / Enhancements</w:t>
         </w:r>
         <w:r>
           <w:rPr>
@@ -1032,7 +1312,7 @@
             <w:noProof/>
             <w:webHidden/>
           </w:rPr>
-          <w:instrText xml:space="preserve"> PAGEREF _Toc241743595 \h </w:instrText>
+          <w:instrText xml:space="preserve"> PAGEREF _Toc242784041 \h </w:instrText>
         </w:r>
         <w:r>
           <w:rPr>
@@ -1052,7 +1332,77 @@
             <w:noProof/>
             <w:webHidden/>
           </w:rPr>
-          <w:t>8</w:t>
+          <w:t>11</w:t>
+        </w:r>
+        <w:r>
+          <w:rPr>
+            <w:noProof/>
+            <w:webHidden/>
+          </w:rPr>
+          <w:fldChar w:fldCharType="end"/>
+        </w:r>
+      </w:hyperlink>
+    </w:p>
+    <w:p>
+      <w:pPr>
+        <w:pStyle w:val="TOC2"/>
+        <w:rPr>
+          <w:rFonts w:asciiTheme="minorHAnsi" w:eastAsiaTheme="minorEastAsia" w:hAnsiTheme="minorHAnsi" w:cstheme="minorBidi"/>
+          <w:noProof/>
+          <w:kern w:val="2"/>
+          <w:sz w:val="24"/>
+          <w:szCs w:val="24"/>
+          <w14:ligatures w14:val="standardContextual"/>
+        </w:rPr>
+      </w:pPr>
+      <w:hyperlink w:anchor="_Toc242784042" w:history="1">
+        <w:r>
+          <w:rPr>
+            <w:rStyle w:val="Hyperlink"/>
+            <w:noProof/>
+          </w:rPr>
+          <w:t>Open / Closed Issues</w:t>
+        </w:r>
+        <w:r>
+          <w:rPr>
+            <w:noProof/>
+            <w:webHidden/>
+          </w:rPr>
+          <w:tab/>
+        </w:r>
+        <w:r>
+          <w:rPr>
+            <w:noProof/>
+            <w:webHidden/>
+          </w:rPr>
+          <w:fldChar w:fldCharType="begin"/>
+        </w:r>
+        <w:r>
+          <w:rPr>
+            <w:noProof/>
+            <w:webHidden/>
+          </w:rPr>
+          <w:instrText xml:space="preserve"> PAGEREF _Toc242784042 \h </w:instrText>
+        </w:r>
+        <w:r>
+          <w:rPr>
+            <w:noProof/>
+            <w:webHidden/>
+          </w:rPr>
+        </w:r>
+        <w:r>
+          <w:rPr>
+            <w:noProof/>
+            <w:webHidden/>
+          </w:rPr>
+          <w:fldChar w:fldCharType="separate"/>
+        </w:r>
+        <w:r>
+          <w:rPr>
+            <w:noProof/>
+            <w:webHidden/>
+          </w:rPr>
+          <w:t>12</w:t>
         </w:r>
         <w:r>
           <w:rPr>
@@ -1075,13 +1425,13 @@
           <w14:ligatures w14:val="standardContextual"/>
         </w:rPr>
       </w:pPr>
-      <w:hyperlink w:anchor="_Toc241743596" w:history="1">
+      <w:hyperlink w:anchor="_Toc242784043" w:history="1">
         <w:r>
           <w:rPr>
             <w:rStyle w:val="Hyperlink"/>
             <w:noProof/>
           </w:rPr>
-          <w:t>Environments</w:t>
+          <w:t>Open Issues</w:t>
         </w:r>
         <w:r>
           <w:rPr>
@@ -1102,7 +1452,7 @@
             <w:noProof/>
             <w:webHidden/>
           </w:rPr>
-          <w:instrText xml:space="preserve"> PAGEREF _Toc241743596 \h </w:instrText>
+          <w:instrText xml:space="preserve"> PAGEREF _Toc242784043 \h </w:instrText>
         </w:r>
         <w:r>
           <w:rPr>
@@ -1122,7 +1472,7 @@
             <w:noProof/>
             <w:webHidden/>
           </w:rPr>
-          <w:t>8</w:t>
+          <w:t>12</w:t>
         </w:r>
         <w:r>
           <w:rPr>
@@ -1145,13 +1495,13 @@
           <w14:ligatures w14:val="standardContextual"/>
         </w:rPr>
       </w:pPr>
-      <w:hyperlink w:anchor="_Toc241743597" w:history="1">
+      <w:hyperlink w:anchor="_Toc242784044" w:history="1">
         <w:r>
           <w:rPr>
             <w:rStyle w:val="Hyperlink"/>
             <w:noProof/>
           </w:rPr>
-          <w:t>Precaution that applies to both test environments</w:t>
+          <w:t>Closed Issues</w:t>
         </w:r>
         <w:r>
           <w:rPr>
@@ -1172,7 +1522,7 @@
             <w:noProof/>
             <w:webHidden/>
           </w:rPr>
-          <w:instrText xml:space="preserve"> PAGEREF _Toc241743597 \h </w:instrText>
+          <w:instrText xml:space="preserve"> PAGEREF _Toc242784044 \h </w:instrText>
         </w:r>
         <w:r>
           <w:rPr>
@@ -1192,147 +1542,7 @@
             <w:noProof/>
             <w:webHidden/>
           </w:rPr>
-          <w:t>8</w:t>
-        </w:r>
-        <w:r>
-          <w:rPr>
-            <w:noProof/>
-            <w:webHidden/>
-          </w:rPr>
-          <w:fldChar w:fldCharType="end"/>
-        </w:r>
-      </w:hyperlink>
-    </w:p>
-    <w:p>
-      <w:pPr>
-        <w:pStyle w:val="TOC3"/>
-        <w:rPr>
-          <w:rFonts w:asciiTheme="minorHAnsi" w:eastAsiaTheme="minorEastAsia" w:hAnsiTheme="minorHAnsi" w:cstheme="minorBidi"/>
-          <w:noProof/>
-          <w:kern w:val="2"/>
-          <w:sz w:val="24"/>
-          <w:szCs w:val="24"/>
-          <w14:ligatures w14:val="standardContextual"/>
-        </w:rPr>
-      </w:pPr>
-      <w:hyperlink w:anchor="_Toc241743598" w:history="1">
-        <w:r>
-          <w:rPr>
-            <w:rStyle w:val="Hyperlink"/>
-            <w:noProof/>
-          </w:rPr>
-          <w:t>Test Cases</w:t>
-        </w:r>
-        <w:r>
-          <w:rPr>
-            <w:noProof/>
-            <w:webHidden/>
-          </w:rPr>
-          <w:tab/>
-        </w:r>
-        <w:r>
-          <w:rPr>
-            <w:noProof/>
-            <w:webHidden/>
-          </w:rPr>
-          <w:fldChar w:fldCharType="begin"/>
-        </w:r>
-        <w:r>
-          <w:rPr>
-            <w:noProof/>
-            <w:webHidden/>
-          </w:rPr>
-          <w:instrText xml:space="preserve"> PAGEREF _Toc241743598 \h </w:instrText>
-        </w:r>
-        <w:r>
-          <w:rPr>
-            <w:noProof/>
-            <w:webHidden/>
-          </w:rPr>
-        </w:r>
-        <w:r>
-          <w:rPr>
-            <w:noProof/>
-            <w:webHidden/>
-          </w:rPr>
-          <w:fldChar w:fldCharType="separate"/>
-        </w:r>
-        <w:r>
-          <w:rPr>
-            <w:noProof/>
-            <w:webHidden/>
-          </w:rPr>
-          <w:t>8</w:t>
-        </w:r>
-        <w:r>
-          <w:rPr>
-            <w:noProof/>
-            <w:webHidden/>
-          </w:rPr>
-          <w:fldChar w:fldCharType="end"/>
-        </w:r>
-      </w:hyperlink>
-    </w:p>
-    <w:p>
-      <w:pPr>
-        <w:pStyle w:val="TOC3"/>
-        <w:rPr>
-          <w:rFonts w:asciiTheme="minorHAnsi" w:eastAsiaTheme="minorEastAsia" w:hAnsiTheme="minorHAnsi" w:cstheme="minorBidi"/>
-          <w:noProof/>
-          <w:kern w:val="2"/>
-          <w:sz w:val="24"/>
-          <w:szCs w:val="24"/>
-          <w14:ligatures w14:val="standardContextual"/>
-        </w:rPr>
-      </w:pPr>
-      <w:hyperlink w:anchor="_Toc241743599" w:history="1">
-        <w:r>
-          <w:rPr>
-            <w:rStyle w:val="Hyperlink"/>
-            <w:noProof/>
-          </w:rPr>
-          <w:t>What has to be true before go-live</w:t>
-        </w:r>
-        <w:r>
-          <w:rPr>
-            <w:noProof/>
-            <w:webHidden/>
-          </w:rPr>
-          <w:tab/>
-        </w:r>
-        <w:r>
-          <w:rPr>
-            <w:noProof/>
-            <w:webHidden/>
-          </w:rPr>
-          <w:fldChar w:fldCharType="begin"/>
-        </w:r>
-        <w:r>
-          <w:rPr>
-            <w:noProof/>
-            <w:webHidden/>
-          </w:rPr>
-          <w:instrText xml:space="preserve"> PAGEREF _Toc241743599 \h </w:instrText>
-        </w:r>
-        <w:r>
-          <w:rPr>
-            <w:noProof/>
-            <w:webHidden/>
-          </w:rPr>
-        </w:r>
-        <w:r>
-          <w:rPr>
-            <w:noProof/>
-            <w:webHidden/>
-          </w:rPr>
-          <w:fldChar w:fldCharType="separate"/>
-        </w:r>
-        <w:r>
-          <w:rPr>
-            <w:noProof/>
-            <w:webHidden/>
-          </w:rPr>
-          <w:t>9</w:t>
+          <w:t>12</w:t>
         </w:r>
         <w:r>
           <w:rPr>
@@ -1355,13 +1565,13 @@
           <w14:ligatures w14:val="standardContextual"/>
         </w:rPr>
       </w:pPr>
-      <w:hyperlink w:anchor="_Toc241743600" w:history="1">
+      <w:hyperlink w:anchor="_Toc242784045" w:history="1">
         <w:r>
           <w:rPr>
             <w:rStyle w:val="Hyperlink"/>
             <w:noProof/>
           </w:rPr>
-          <w:t>Future Features / Updates / Enhancements</w:t>
+          <w:t>Appendix - Sample of Unsuitable Wording</w:t>
         </w:r>
         <w:r>
           <w:rPr>
@@ -1382,7 +1592,7 @@
             <w:noProof/>
             <w:webHidden/>
           </w:rPr>
-          <w:instrText xml:space="preserve"> PAGEREF _Toc241743600 \h </w:instrText>
+          <w:instrText xml:space="preserve"> PAGEREF _Toc242784045 \h </w:instrText>
         </w:r>
         <w:r>
           <w:rPr>
@@ -1402,7 +1612,7 @@
             <w:noProof/>
             <w:webHidden/>
           </w:rPr>
-          <w:t>10</w:t>
+          <w:t>13</w:t>
         </w:r>
         <w:r>
           <w:rPr>
@@ -1416,496 +1626,6 @@
     <w:p>
       <w:pPr>
         <w:pStyle w:val="TOC2"/>
-        <w:rPr>
-          <w:rFonts w:asciiTheme="minorHAnsi" w:eastAsiaTheme="minorEastAsia" w:hAnsiTheme="minorHAnsi" w:cstheme="minorBidi"/>
-          <w:noProof/>
-          <w:kern w:val="2"/>
-          <w:sz w:val="24"/>
-          <w:szCs w:val="24"/>
-          <w14:ligatures w14:val="standardContextual"/>
-        </w:rPr>
-      </w:pPr>
-      <w:hyperlink w:anchor="_Toc241743601" w:history="1">
-        <w:r>
-          <w:rPr>
-            <w:rStyle w:val="Hyperlink"/>
-            <w:noProof/>
-          </w:rPr>
-          <w:t>Open / Closed Issues</w:t>
-        </w:r>
-        <w:r>
-          <w:rPr>
-            <w:noProof/>
-            <w:webHidden/>
-          </w:rPr>
-          <w:tab/>
-        </w:r>
-        <w:r>
-          <w:rPr>
-            <w:noProof/>
-            <w:webHidden/>
-          </w:rPr>
-          <w:fldChar w:fldCharType="begin"/>
-        </w:r>
-        <w:r>
-          <w:rPr>
-            <w:noProof/>
-            <w:webHidden/>
-          </w:rPr>
-          <w:instrText xml:space="preserve"> PAGEREF _Toc241743601 \h </w:instrText>
-        </w:r>
-        <w:r>
-          <w:rPr>
-            <w:noProof/>
-            <w:webHidden/>
-          </w:rPr>
-        </w:r>
-        <w:r>
-          <w:rPr>
-            <w:noProof/>
-            <w:webHidden/>
-          </w:rPr>
-          <w:fldChar w:fldCharType="separate"/>
-        </w:r>
-        <w:r>
-          <w:rPr>
-            <w:noProof/>
-            <w:webHidden/>
-          </w:rPr>
-          <w:t>11</w:t>
-        </w:r>
-        <w:r>
-          <w:rPr>
-            <w:noProof/>
-            <w:webHidden/>
-          </w:rPr>
-          <w:fldChar w:fldCharType="end"/>
-        </w:r>
-      </w:hyperlink>
-    </w:p>
-    <w:p>
-      <w:pPr>
-        <w:pStyle w:val="TOC3"/>
-        <w:rPr>
-          <w:rFonts w:asciiTheme="minorHAnsi" w:eastAsiaTheme="minorEastAsia" w:hAnsiTheme="minorHAnsi" w:cstheme="minorBidi"/>
-          <w:noProof/>
-          <w:kern w:val="2"/>
-          <w:sz w:val="24"/>
-          <w:szCs w:val="24"/>
-          <w14:ligatures w14:val="standardContextual"/>
-        </w:rPr>
-      </w:pPr>
-      <w:hyperlink w:anchor="_Toc241743602" w:history="1">
-        <w:r>
-          <w:rPr>
-            <w:rStyle w:val="Hyperlink"/>
-            <w:noProof/>
-          </w:rPr>
-          <w:t>Open Issues</w:t>
-        </w:r>
-        <w:r>
-          <w:rPr>
-            <w:noProof/>
-            <w:webHidden/>
-          </w:rPr>
-          <w:tab/>
-        </w:r>
-        <w:r>
-          <w:rPr>
-            <w:noProof/>
-            <w:webHidden/>
-          </w:rPr>
-          <w:fldChar w:fldCharType="begin"/>
-        </w:r>
-        <w:r>
-          <w:rPr>
-            <w:noProof/>
-            <w:webHidden/>
-          </w:rPr>
-          <w:instrText xml:space="preserve"> PAGEREF _Toc241743602 \h </w:instrText>
-        </w:r>
-        <w:r>
-          <w:rPr>
-            <w:noProof/>
-            <w:webHidden/>
-          </w:rPr>
-        </w:r>
-        <w:r>
-          <w:rPr>
-            <w:noProof/>
-            <w:webHidden/>
-          </w:rPr>
-          <w:fldChar w:fldCharType="separate"/>
-        </w:r>
-        <w:r>
-          <w:rPr>
-            <w:noProof/>
-            <w:webHidden/>
-          </w:rPr>
-          <w:t>11</w:t>
-        </w:r>
-        <w:r>
-          <w:rPr>
-            <w:noProof/>
-            <w:webHidden/>
-          </w:rPr>
-          <w:fldChar w:fldCharType="end"/>
-        </w:r>
-      </w:hyperlink>
-    </w:p>
-    <w:p>
-      <w:pPr>
-        <w:pStyle w:val="TOC3"/>
-        <w:rPr>
-          <w:rFonts w:asciiTheme="minorHAnsi" w:eastAsiaTheme="minorEastAsia" w:hAnsiTheme="minorHAnsi" w:cstheme="minorBidi"/>
-          <w:noProof/>
-          <w:kern w:val="2"/>
-          <w:sz w:val="24"/>
-          <w:szCs w:val="24"/>
-          <w14:ligatures w14:val="standardContextual"/>
-        </w:rPr>
-      </w:pPr>
-      <w:hyperlink w:anchor="_Toc241743603" w:history="1">
-        <w:r>
-          <w:rPr>
-            <w:rStyle w:val="Hyperlink"/>
-            <w:noProof/>
-          </w:rPr>
-          <w:t>Closed Issues</w:t>
-        </w:r>
-        <w:r>
-          <w:rPr>
-            <w:noProof/>
-            <w:webHidden/>
-          </w:rPr>
-          <w:tab/>
-        </w:r>
-        <w:r>
-          <w:rPr>
-            <w:noProof/>
-            <w:webHidden/>
-          </w:rPr>
-          <w:fldChar w:fldCharType="begin"/>
-        </w:r>
-        <w:r>
-          <w:rPr>
-            <w:noProof/>
-            <w:webHidden/>
-          </w:rPr>
-          <w:instrText xml:space="preserve"> PAGEREF _Toc241743603 \h </w:instrText>
-        </w:r>
-        <w:r>
-          <w:rPr>
-            <w:noProof/>
-            <w:webHidden/>
-          </w:rPr>
-        </w:r>
-        <w:r>
-          <w:rPr>
-            <w:noProof/>
-            <w:webHidden/>
-          </w:rPr>
-          <w:fldChar w:fldCharType="separate"/>
-        </w:r>
-        <w:r>
-          <w:rPr>
-            <w:noProof/>
-            <w:webHidden/>
-          </w:rPr>
-          <w:t>11</w:t>
-        </w:r>
-        <w:r>
-          <w:rPr>
-            <w:noProof/>
-            <w:webHidden/>
-          </w:rPr>
-          <w:fldChar w:fldCharType="end"/>
-        </w:r>
-      </w:hyperlink>
-    </w:p>
-    <w:p>
-      <w:pPr>
-        <w:pStyle w:val="TOC2"/>
-        <w:rPr>
-          <w:rFonts w:asciiTheme="minorHAnsi" w:eastAsiaTheme="minorEastAsia" w:hAnsiTheme="minorHAnsi" w:cstheme="minorBidi"/>
-          <w:noProof/>
-          <w:kern w:val="2"/>
-          <w:sz w:val="24"/>
-          <w:szCs w:val="24"/>
-          <w14:ligatures w14:val="standardContextual"/>
-        </w:rPr>
-      </w:pPr>
-      <w:hyperlink w:anchor="_Toc241743604" w:history="1">
-        <w:r>
-          <w:rPr>
-            <w:rStyle w:val="Hyperlink"/>
-            <w:noProof/>
-          </w:rPr>
-          <w:t>Appendix - Technical Reference</w:t>
-        </w:r>
-        <w:r>
-          <w:rPr>
-            <w:noProof/>
-            <w:webHidden/>
-          </w:rPr>
-          <w:tab/>
-        </w:r>
-        <w:r>
-          <w:rPr>
-            <w:noProof/>
-            <w:webHidden/>
-          </w:rPr>
-          <w:fldChar w:fldCharType="begin"/>
-        </w:r>
-        <w:r>
-          <w:rPr>
-            <w:noProof/>
-            <w:webHidden/>
-          </w:rPr>
-          <w:instrText xml:space="preserve"> PAGEREF _Toc241743604 \h </w:instrText>
-        </w:r>
-        <w:r>
-          <w:rPr>
-            <w:noProof/>
-            <w:webHidden/>
-          </w:rPr>
-        </w:r>
-        <w:r>
-          <w:rPr>
-            <w:noProof/>
-            <w:webHidden/>
-          </w:rPr>
-          <w:fldChar w:fldCharType="separate"/>
-        </w:r>
-        <w:r>
-          <w:rPr>
-            <w:noProof/>
-            <w:webHidden/>
-          </w:rPr>
-          <w:t>12</w:t>
-        </w:r>
-        <w:r>
-          <w:rPr>
-            <w:noProof/>
-            <w:webHidden/>
-          </w:rPr>
-          <w:fldChar w:fldCharType="end"/>
-        </w:r>
-      </w:hyperlink>
-    </w:p>
-    <w:p>
-      <w:pPr>
-        <w:pStyle w:val="TOC3"/>
-        <w:rPr>
-          <w:rFonts w:asciiTheme="minorHAnsi" w:eastAsiaTheme="minorEastAsia" w:hAnsiTheme="minorHAnsi" w:cstheme="minorBidi"/>
-          <w:noProof/>
-          <w:kern w:val="2"/>
-          <w:sz w:val="24"/>
-          <w:szCs w:val="24"/>
-          <w14:ligatures w14:val="standardContextual"/>
-        </w:rPr>
-      </w:pPr>
-      <w:hyperlink w:anchor="_Toc241743605" w:history="1">
-        <w:r>
-          <w:rPr>
-            <w:rStyle w:val="Hyperlink"/>
-            <w:noProof/>
-          </w:rPr>
-          <w:t>Why two rules are needed</w:t>
-        </w:r>
-        <w:r>
-          <w:rPr>
-            <w:noProof/>
-            <w:webHidden/>
-          </w:rPr>
-          <w:tab/>
-        </w:r>
-        <w:r>
-          <w:rPr>
-            <w:noProof/>
-            <w:webHidden/>
-          </w:rPr>
-          <w:fldChar w:fldCharType="begin"/>
-        </w:r>
-        <w:r>
-          <w:rPr>
-            <w:noProof/>
-            <w:webHidden/>
-          </w:rPr>
-          <w:instrText xml:space="preserve"> PAGEREF _Toc241743605 \h </w:instrText>
-        </w:r>
-        <w:r>
-          <w:rPr>
-            <w:noProof/>
-            <w:webHidden/>
-          </w:rPr>
-        </w:r>
-        <w:r>
-          <w:rPr>
-            <w:noProof/>
-            <w:webHidden/>
-          </w:rPr>
-          <w:fldChar w:fldCharType="separate"/>
-        </w:r>
-        <w:r>
-          <w:rPr>
-            <w:noProof/>
-            <w:webHidden/>
-          </w:rPr>
-          <w:t>12</w:t>
-        </w:r>
-        <w:r>
-          <w:rPr>
-            <w:noProof/>
-            <w:webHidden/>
-          </w:rPr>
-          <w:fldChar w:fldCharType="end"/>
-        </w:r>
-      </w:hyperlink>
-    </w:p>
-    <w:p>
-      <w:pPr>
-        <w:pStyle w:val="TOC3"/>
-        <w:rPr>
-          <w:rFonts w:asciiTheme="minorHAnsi" w:eastAsiaTheme="minorEastAsia" w:hAnsiTheme="minorHAnsi" w:cstheme="minorBidi"/>
-          <w:noProof/>
-          <w:kern w:val="2"/>
-          <w:sz w:val="24"/>
-          <w:szCs w:val="24"/>
-          <w14:ligatures w14:val="standardContextual"/>
-        </w:rPr>
-      </w:pPr>
-      <w:hyperlink w:anchor="_Toc241743606" w:history="1">
-        <w:r>
-          <w:rPr>
-            <w:rStyle w:val="Hyperlink"/>
-            <w:noProof/>
-          </w:rPr>
-          <w:t>Field constraints</w:t>
-        </w:r>
-        <w:r>
-          <w:rPr>
-            <w:noProof/>
-            <w:webHidden/>
-          </w:rPr>
-          <w:tab/>
-        </w:r>
-        <w:r>
-          <w:rPr>
-            <w:noProof/>
-            <w:webHidden/>
-          </w:rPr>
-          <w:fldChar w:fldCharType="begin"/>
-        </w:r>
-        <w:r>
-          <w:rPr>
-            <w:noProof/>
-            <w:webHidden/>
-          </w:rPr>
-          <w:instrText xml:space="preserve"> PAGEREF _Toc241743606 \h </w:instrText>
-        </w:r>
-        <w:r>
-          <w:rPr>
-            <w:noProof/>
-            <w:webHidden/>
-          </w:rPr>
-        </w:r>
-        <w:r>
-          <w:rPr>
-            <w:noProof/>
-            <w:webHidden/>
-          </w:rPr>
-          <w:fldChar w:fldCharType="separate"/>
-        </w:r>
-        <w:r>
-          <w:rPr>
-            <w:noProof/>
-            <w:webHidden/>
-          </w:rPr>
-          <w:t>12</w:t>
-        </w:r>
-        <w:r>
-          <w:rPr>
-            <w:noProof/>
-            <w:webHidden/>
-          </w:rPr>
-          <w:fldChar w:fldCharType="end"/>
-        </w:r>
-      </w:hyperlink>
-    </w:p>
-    <w:p>
-      <w:pPr>
-        <w:pStyle w:val="TOC3"/>
-        <w:rPr>
-          <w:rFonts w:asciiTheme="minorHAnsi" w:eastAsiaTheme="minorEastAsia" w:hAnsiTheme="minorHAnsi" w:cstheme="minorBidi"/>
-          <w:noProof/>
-          <w:kern w:val="2"/>
-          <w:sz w:val="24"/>
-          <w:szCs w:val="24"/>
-          <w14:ligatures w14:val="standardContextual"/>
-        </w:rPr>
-      </w:pPr>
-      <w:hyperlink w:anchor="_Toc241743607" w:history="1">
-        <w:r>
-          <w:rPr>
-            <w:rStyle w:val="Hyperlink"/>
-            <w:noProof/>
-          </w:rPr>
-          <w:t>Implementation constraints</w:t>
-        </w:r>
-        <w:r>
-          <w:rPr>
-            <w:noProof/>
-            <w:webHidden/>
-          </w:rPr>
-          <w:tab/>
-        </w:r>
-        <w:r>
-          <w:rPr>
-            <w:noProof/>
-            <w:webHidden/>
-          </w:rPr>
-          <w:fldChar w:fldCharType="begin"/>
-        </w:r>
-        <w:r>
-          <w:rPr>
-            <w:noProof/>
-            <w:webHidden/>
-          </w:rPr>
-          <w:instrText xml:space="preserve"> PAGEREF _Toc241743607 \h </w:instrText>
-        </w:r>
-        <w:r>
-          <w:rPr>
-            <w:noProof/>
-            <w:webHidden/>
-          </w:rPr>
-        </w:r>
-        <w:r>
-          <w:rPr>
-            <w:noProof/>
-            <w:webHidden/>
-          </w:rPr>
-          <w:fldChar w:fldCharType="separate"/>
-        </w:r>
-        <w:r>
-          <w:rPr>
-            <w:noProof/>
-            <w:webHidden/>
-          </w:rPr>
-          <w:t>12</w:t>
-        </w:r>
-        <w:r>
-          <w:rPr>
-            <w:noProof/>
-            <w:webHidden/>
-          </w:rPr>
-          <w:fldChar w:fldCharType="end"/>
-        </w:r>
-      </w:hyperlink>
-    </w:p>
-    <w:p>
-      <w:pPr>
-        <w:pStyle w:val="TOC2"/>
       </w:pPr>
       <w:r>
         <w:fldChar w:fldCharType="end"/>
@@ -1920,7 +1640,7 @@
       <w:pPr>
         <w:pStyle w:val="Heading2"/>
       </w:pPr>
-      <w:bookmarkStart w:id="0" w:name="_Toc241743583"/>
+      <w:bookmarkStart w:id="0" w:name="_Toc242784025"/>
       <w:r>
         <w:lastRenderedPageBreak/>
         <w:t>Document Control</w:t>
@@ -1936,7 +1656,7 @@
       <w:pPr>
         <w:pStyle w:val="Heading3"/>
       </w:pPr>
-      <w:bookmarkStart w:id="1" w:name="_Toc241743584"/>
+      <w:bookmarkStart w:id="1" w:name="_Toc242784026"/>
       <w:r>
         <w:t>Change Record</w:t>
       </w:r>
@@ -2535,6 +2255,87 @@
           </w:p>
         </w:tc>
       </w:tr>
+      <w:tr>
+        <w:trPr>
+          <w:cantSplit/>
+        </w:trPr>
+        <w:tc>
+          <w:tcPr>
+            <w:tcW w:w="975" w:type="dxa"/>
+          </w:tcPr>
+          <w:p>
+            <w:pPr>
+              <w:pStyle w:val="TableText"/>
+              <w:rPr>
+                <w:sz w:val="18"/>
+              </w:rPr>
+            </w:pPr>
+            <w:r>
+              <w:rPr>
+                <w:sz w:val="18"/>
+              </w:rPr>
+              <w:t>2026-10-13</w:t>
+            </w:r>
+          </w:p>
+        </w:tc>
+        <w:tc>
+          <w:tcPr>
+            <w:tcW w:w="1890" w:type="dxa"/>
+          </w:tcPr>
+          <w:p>
+            <w:pPr>
+              <w:pStyle w:val="TableText"/>
+              <w:rPr>
+                <w:sz w:val="18"/>
+              </w:rPr>
+            </w:pPr>
+            <w:r>
+              <w:rPr>
+                <w:sz w:val="18"/>
+              </w:rPr>
+              <w:t>M. Goldyn</w:t>
+            </w:r>
+          </w:p>
+        </w:tc>
+        <w:tc>
+          <w:tcPr>
+            <w:tcW w:w="879" w:type="dxa"/>
+          </w:tcPr>
+          <w:p>
+            <w:pPr>
+              <w:pStyle w:val="TableText"/>
+              <w:rPr>
+                <w:sz w:val="18"/>
+              </w:rPr>
+            </w:pPr>
+            <w:r>
+              <w:rPr>
+                <w:sz w:val="18"/>
+              </w:rPr>
+              <w:t>1.1</w:t>
+            </w:r>
+          </w:p>
+        </w:tc>
+        <w:tc>
+          <w:tcPr>
+            <w:tcW w:w="4140" w:type="dxa"/>
+          </w:tcPr>
+          <w:p>
+            <w:pPr>
+              <w:pStyle w:val="TableText"/>
+              <w:rPr>
+                <w:sz w:val="18"/>
+              </w:rPr>
+            </w:pPr>
+            <w:r>
+              <w:rPr>
+                <w:sz w:val="18"/>
+              </w:rPr>
+              <w:t>Added Rule 5 (orders from location 281 are excluded). Screenshot added. Results section removed. Terminology standardized to P21. Appendix replaced with a sample of unsuitable wording. Test email precautions revised.</w:t>
+            </w:r>
+          </w:p>
+        </w:tc>
+      </w:tr>
     </w:tbl>
     <w:p>
       <w:pPr>
@@ -2545,7 +2346,7 @@
       <w:pPr>
         <w:pStyle w:val="Heading3"/>
       </w:pPr>
-      <w:bookmarkStart w:id="2" w:name="_Toc241743585"/>
+      <w:bookmarkStart w:id="2" w:name="_Toc242784027"/>
       <w:r>
         <w:t>Reviewers</w:t>
       </w:r>
@@ -2796,7 +2597,7 @@
       <w:pPr>
         <w:pStyle w:val="Heading2"/>
       </w:pPr>
-      <w:bookmarkStart w:id="3" w:name="_Toc241743586"/>
+      <w:bookmarkStart w:id="3" w:name="_Toc242784028"/>
       <w:r>
         <w:lastRenderedPageBreak/>
         <w:t>Overview</w:t>
@@ -2808,10 +2609,25 @@
         <w:pStyle w:val="BodyText"/>
       </w:pPr>
       <w:r>
-        <w:t>When a customer service representative emails an Order Acknowledgment from Prophet21, the subject line identifies the document by the All Surfaces order number only. A customer or territory manager searching their own mailbox is searching for a number they recognize, which is normally their own purchase order number or the job it relates to, not ours. This document describes a Prophet21 business rule that adds the customer PO number and the Sidemark to the Order Acknowledgment email subject at the point the</w:t>
-      </w:r>
-      <w:r>
-        <w:t xml:space="preserve"> message is sent.</w:t>
+        <w:t>When a customer service representative emails an Order Acknowledgment from Prophet</w:t>
+      </w:r>
+      <w:r>
+        <w:t xml:space="preserve"> </w:t>
+      </w:r>
+      <w:r>
+        <w:t>21</w:t>
+      </w:r>
+      <w:r>
+        <w:t xml:space="preserve"> (P21)</w:t>
+      </w:r>
+      <w:r>
+        <w:t xml:space="preserve">, the subject line identifies the document by the All Surfaces order number only. A customer or territory manager searching their own mailbox is searching for a number they recognize, which is normally their own purchase order number or the job it relates to, not ours. This document describes a P21 business rule that adds the customer PO number and the Sidemark </w:t>
+      </w:r>
+      <w:r>
+        <w:t xml:space="preserve">(Job Name) </w:t>
+      </w:r>
+      <w:r>
+        <w:t>to the Order Acknowledgment email subject at the point the message is sent.</w:t>
       </w:r>
     </w:p>
     <w:p>
@@ -2857,7 +2673,19 @@
         <w:rPr>
           <w:b/>
         </w:rPr>
-        <w:t>With this rule in place it reads:</w:t>
+        <w:t xml:space="preserve">With this rule in </w:t>
+      </w:r>
+      <w:r>
+        <w:rPr>
+          <w:b/>
+        </w:rPr>
+        <w:t>place,</w:t>
+      </w:r>
+      <w:r>
+        <w:rPr>
+          <w:b/>
+        </w:rPr>
+        <w:t xml:space="preserve"> it reads:</w:t>
       </w:r>
     </w:p>
     <w:p>
@@ -2884,7 +2712,19 @@
         <w:pStyle w:val="BodyText"/>
       </w:pPr>
       <w:r>
-        <w:t>The representative does nothing differently and no step is added to the send process.</w:t>
+        <w:t xml:space="preserve">The </w:t>
+      </w:r>
+      <w:r>
+        <w:t>user</w:t>
+      </w:r>
+      <w:r>
+        <w:t xml:space="preserve"> does nothing differently and no step is added to the </w:t>
+      </w:r>
+      <w:r>
+        <w:t>sending</w:t>
+      </w:r>
+      <w:r>
+        <w:t xml:space="preserve"> process.</w:t>
       </w:r>
     </w:p>
     <w:p>
@@ -2900,7 +2740,19 @@
         <w:rPr>
           <w:b/>
         </w:rPr>
-        <w:t xml:space="preserve">If the person sending the email types their own subject, the rule does nothing at all. </w:t>
+        <w:t xml:space="preserve">If the person sending the email </w:t>
+      </w:r>
+      <w:r>
+        <w:rPr>
+          <w:b/>
+        </w:rPr>
+        <w:t>types their own</w:t>
+      </w:r>
+      <w:r>
+        <w:rPr>
+          <w:b/>
+        </w:rPr>
+        <w:t xml:space="preserve"> subject, the rule does nothing at all. </w:t>
       </w:r>
       <w:r>
         <w:t>What they typed is what the customer receives, unchanged. The rule only fills in a subject that would otherwise have been left blank.</w:t>
@@ -2915,7 +2767,7 @@
       <w:pPr>
         <w:pStyle w:val="Heading3"/>
       </w:pPr>
-      <w:bookmarkStart w:id="4" w:name="_Toc241743587"/>
+      <w:bookmarkStart w:id="4" w:name="_Toc242784029"/>
       <w:r>
         <w:t>Objectives</w:t>
       </w:r>
@@ -2932,6 +2784,11 @@
     <w:p>
       <w:pPr>
         <w:pStyle w:val="ListParagraph"/>
+        <w:numPr>
+          <w:ilvl w:val="0"/>
+          <w:numId w:val="23"/>
+        </w:numPr>
+        <w:spacing w:before="0" w:after="60"/>
       </w:pPr>
       <w:r>
         <w:t>Allow a customer to find an Order Acknowledgment in their own mailbox by searching for their purchase order number or the job name.</w:t>
@@ -2940,6 +2797,11 @@
     <w:p>
       <w:pPr>
         <w:pStyle w:val="ListParagraph"/>
+        <w:numPr>
+          <w:ilvl w:val="0"/>
+          <w:numId w:val="23"/>
+        </w:numPr>
+        <w:spacing w:before="0" w:after="60"/>
       </w:pPr>
       <w:r>
         <w:t>Allow territory managers and internal staff to do the same without opening each message.</w:t>
@@ -2948,30 +2810,56 @@
     <w:p>
       <w:pPr>
         <w:pStyle w:val="ListParagraph"/>
-      </w:pPr>
-      <w:r>
-        <w:t>Require no change to the representative workflow, no extra keystrokes and no training.</w:t>
+        <w:numPr>
+          <w:ilvl w:val="0"/>
+          <w:numId w:val="23"/>
+        </w:numPr>
+        <w:spacing w:before="0" w:after="60"/>
+      </w:pPr>
+      <w:r>
+        <w:t>Require no change to the user workflow, no extra keystrokes and no training.</w:t>
       </w:r>
     </w:p>
     <w:p>
       <w:pPr>
         <w:pStyle w:val="ListParagraph"/>
-      </w:pPr>
-      <w:r>
-        <w:t>Defer completely to the representative. If they wrote their own subject, that is what sends.</w:t>
+        <w:numPr>
+          <w:ilvl w:val="0"/>
+          <w:numId w:val="23"/>
+        </w:numPr>
+        <w:spacing w:before="0" w:after="60"/>
+      </w:pPr>
+      <w:r>
+        <w:t>Defer completely to the user. If they wrote their own subject, that is what sends.</w:t>
       </w:r>
     </w:p>
     <w:p>
       <w:pPr>
         <w:pStyle w:val="ListParagraph"/>
-      </w:pPr>
-      <w:r>
-        <w:t>Never interfere with the sending of an email. If the rule cannot produce a sensible subject it makes no change.</w:t>
+        <w:numPr>
+          <w:ilvl w:val="0"/>
+          <w:numId w:val="23"/>
+        </w:numPr>
+        <w:spacing w:before="0" w:after="60"/>
+      </w:pPr>
+      <w:r>
+        <w:t xml:space="preserve">Never interfere with the sending of an email. If the rule cannot produce a sensible </w:t>
+      </w:r>
+      <w:r>
+        <w:t>subject,</w:t>
+      </w:r>
+      <w:r>
+        <w:t xml:space="preserve"> it makes no change.</w:t>
       </w:r>
     </w:p>
     <w:p>
       <w:pPr>
         <w:pStyle w:val="ListParagraph"/>
+        <w:numPr>
+          <w:ilvl w:val="0"/>
+          <w:numId w:val="23"/>
+        </w:numPr>
+        <w:spacing w:before="0" w:after="60"/>
       </w:pPr>
       <w:r>
         <w:t>Expose no internal, incomplete or inappropriate content to the recipient.</w:t>
@@ -2986,7 +2874,7 @@
       <w:pPr>
         <w:pStyle w:val="Heading3"/>
       </w:pPr>
-      <w:bookmarkStart w:id="5" w:name="_Toc241743588"/>
+      <w:bookmarkStart w:id="5" w:name="_Toc242784030"/>
       <w:r>
         <w:t>Definitions</w:t>
       </w:r>
@@ -3021,7 +2909,10 @@
         <w:pStyle w:val="BodyText"/>
       </w:pPr>
       <w:r>
-        <w:t>The purchase order number the customer gave us for the order. It is their reference, not ours, which is why it is the most useful thing to put in front of them.</w:t>
+        <w:t>The purchase order number the customer gave us for the order. It is their reference, not ours</w:t>
+      </w:r>
+      <w:r>
+        <w:t>.</w:t>
       </w:r>
     </w:p>
     <w:p>
@@ -3054,7 +2945,13 @@
         <w:pStyle w:val="BodyText"/>
       </w:pPr>
       <w:r>
-        <w:t>Prophet21 writes the first part of the subject itself, in the form "All Surfaces - Acknowledgement# 6109021". Everything after that shares a fixed and fairly small amount of space, which the person sending the email and this rule both draw on. That is why the rule gives way whenever someone has typed their own text.</w:t>
+        <w:t xml:space="preserve">P21 writes the first part of the subject itself, in the form "All Surfaces - Acknowledgement# 6109021". Everything after that shares a fixed and </w:t>
+      </w:r>
+      <w:r>
+        <w:t>small</w:t>
+      </w:r>
+      <w:r>
+        <w:t xml:space="preserve"> amount of space, which the person sending the email and this rule both draw on. That is why the rule gives way whenever someone has typed their own text.</w:t>
       </w:r>
     </w:p>
     <w:p>
@@ -3066,7 +2963,7 @@
       <w:pPr>
         <w:pStyle w:val="Heading3"/>
       </w:pPr>
-      <w:bookmarkStart w:id="6" w:name="_Toc241743589"/>
+      <w:bookmarkStart w:id="6" w:name="_Toc242784031"/>
       <w:r>
         <w:t>Assumptions</w:t>
       </w:r>
@@ -3083,6 +2980,11 @@
     <w:p>
       <w:pPr>
         <w:pStyle w:val="Bullet1"/>
+        <w:numPr>
+          <w:ilvl w:val="0"/>
+          <w:numId w:val="23"/>
+        </w:numPr>
+        <w:spacing w:after="60"/>
       </w:pPr>
       <w:r>
         <w:t>An Order Acknowledgment always covers exactly one order, so there is never more than one PO number or job to show.</w:t>
@@ -3091,6 +2993,11 @@
     <w:p>
       <w:pPr>
         <w:pStyle w:val="Bullet1"/>
+        <w:numPr>
+          <w:ilvl w:val="0"/>
+          <w:numId w:val="23"/>
+        </w:numPr>
+        <w:spacing w:after="60"/>
       </w:pPr>
       <w:r>
         <w:t>The customer PO number is the reference a recipient is most likely to recognize, and nearly every order has one.</w:t>
@@ -3099,6 +3006,11 @@
     <w:p>
       <w:pPr>
         <w:pStyle w:val="Bullet1"/>
+        <w:numPr>
+          <w:ilvl w:val="0"/>
+          <w:numId w:val="23"/>
+        </w:numPr>
+        <w:spacing w:after="60"/>
       </w:pPr>
       <w:r>
         <w:t>Text typed by the person sending the email is deliberate. It takes priority over anything this rule would add, and is never shortened, replaced or competed with.</w:t>
@@ -3107,6 +3019,11 @@
     <w:p>
       <w:pPr>
         <w:pStyle w:val="Bullet1"/>
+        <w:numPr>
+          <w:ilvl w:val="0"/>
+          <w:numId w:val="23"/>
+        </w:numPr>
+        <w:spacing w:after="60"/>
       </w:pPr>
       <w:r>
         <w:t>The Sidemark is helpful to a customer when it names a job or a site, and unsuitable when it has been used as a working note. Both happen today, which is why the safeguards in this document exist.</w:t>
@@ -3115,20 +3032,17 @@
     <w:p>
       <w:pPr>
         <w:pStyle w:val="Bullet1"/>
+        <w:numPr>
+          <w:ilvl w:val="0"/>
+          <w:numId w:val="23"/>
+        </w:numPr>
+        <w:spacing w:after="60"/>
       </w:pPr>
       <w:r>
         <w:t>There is no opportunity to change the subject after the person clicks Send, so whatever the rule does must be done at that moment.</w:t>
       </w:r>
     </w:p>
     <w:p>
-      <w:pPr>
-        <w:pStyle w:val="Bullet1"/>
-      </w:pPr>
-      <w:r>
-        <w:t>The environments used for testing hold real customer data and can send real email, so every test send must be addressed to the tester.</w:t>
-      </w:r>
-    </w:p>
-    <w:p>
       <w:r>
         <w:br w:type="page"/>
       </w:r>
@@ -3137,7 +3051,7 @@
       <w:pPr>
         <w:pStyle w:val="Heading2"/>
       </w:pPr>
-      <w:bookmarkStart w:id="7" w:name="_Toc241743590"/>
+      <w:bookmarkStart w:id="7" w:name="_Toc242784032"/>
       <w:r>
         <w:lastRenderedPageBreak/>
         <w:t>How It Works</w:t>
@@ -3149,7 +3063,13 @@
         <w:pStyle w:val="BodyText"/>
       </w:pPr>
       <w:r>
-        <w:t>This section describes what the rule does, in the order it decides it. Nothing changes about how an order is entered or how an email is sent. The only thing that changes is what appears in the subject line of the email that goes out.</w:t>
+        <w:t xml:space="preserve">This section describes what the rule does, in the order it decides it. Nothing changes about how an order is entered or how an email is sent. The only thing that changes </w:t>
+      </w:r>
+      <w:r>
+        <w:t>is</w:t>
+      </w:r>
+      <w:r>
+        <w:t xml:space="preserve"> what appears in the subject line of the email that goes out.</w:t>
       </w:r>
     </w:p>
     <w:p>
@@ -3161,7 +3081,7 @@
       <w:pPr>
         <w:pStyle w:val="Heading3"/>
       </w:pPr>
-      <w:bookmarkStart w:id="8" w:name="_Toc241743591"/>
+      <w:bookmarkStart w:id="8" w:name="_Toc242784033"/>
       <w:r>
         <w:t>Where the information comes from</w:t>
       </w:r>
@@ -3178,6 +3098,11 @@
     <w:p>
       <w:pPr>
         <w:pStyle w:val="Bullet1"/>
+        <w:numPr>
+          <w:ilvl w:val="0"/>
+          <w:numId w:val="23"/>
+        </w:numPr>
+        <w:spacing w:after="60"/>
       </w:pPr>
       <w:r>
         <w:t>The customer PO number, as entered on the order.</w:t>
@@ -3186,6 +3111,11 @@
     <w:p>
       <w:pPr>
         <w:pStyle w:val="Bullet1"/>
+        <w:numPr>
+          <w:ilvl w:val="0"/>
+          <w:numId w:val="23"/>
+        </w:numPr>
+        <w:spacing w:after="60"/>
       </w:pPr>
       <w:r>
         <w:t>The Sidemark, as entered on the order.</w:t>
@@ -3207,25 +3137,74 @@
     <w:p>
       <w:pPr>
         <w:pStyle w:val="BodyText"/>
-        <w:pBdr>
-          <w:top w:val="dashed" w:sz="6" w:space="6" w:color="808080"/>
-          <w:left w:val="dashed" w:sz="6" w:space="6" w:color="808080"/>
-          <w:bottom w:val="dashed" w:sz="6" w:space="6" w:color="808080"/>
-          <w:right w:val="dashed" w:sz="6" w:space="6" w:color="808080"/>
-        </w:pBdr>
-        <w:jc w:val="center"/>
+        <w:keepNext/>
+        <w:spacing w:after="60"/>
       </w:pPr>
       <w:r>
         <w:rPr>
           <w:i/>
+          <w:noProof/>
           <w:color w:val="808080"/>
         </w:rPr>
-        <w:t>Screenshot to be inserted: the Email window as the sender sees it, with the subject box highlighted.</w:t>
+        <w:drawing>
+          <wp:inline distT="0" distB="0" distL="0" distR="0" wp14:anchorId="408F20B1" wp14:editId="14945CD4">
+            <wp:extent cx="5029200" cy="3698118"/>
+            <wp:effectExtent l="0" t="0" r="0" b="0"/>
+            <wp:docPr id="2081075726" name="Picture 1" descr="Email Order Acknowledgment window with the Subject box outlined in red"/>
+            <wp:cNvGraphicFramePr>
+              <a:graphicFrameLocks xmlns:a="http://schemas.openxmlformats.org/drawingml/2006/main" noChangeAspect="1"/>
+            </wp:cNvGraphicFramePr>
+            <a:graphic xmlns:a="http://schemas.openxmlformats.org/drawingml/2006/main">
+              <a:graphicData uri="http://schemas.openxmlformats.org/drawingml/2006/picture">
+                <pic:pic xmlns:pic="http://schemas.openxmlformats.org/drawingml/2006/picture">
+                  <pic:nvPicPr>
+                    <pic:cNvPr id="2081075726" name="Picture 2081075726"/>
+                    <pic:cNvPicPr/>
+                  </pic:nvPicPr>
+                  <pic:blipFill>
+                    <a:blip r:embed="rId11">
+                      <a:extLst>
+                        <a:ext uri="{28A0092B-C50C-407E-A947-70E740481C1C}">
+                          <a14:useLocalDpi xmlns:a14="http://schemas.microsoft.com/office/drawing/2010/main" val="0"/>
+                        </a:ext>
+                      </a:extLst>
+                    </a:blip>
+                    <a:stretch>
+                      <a:fillRect/>
+                    </a:stretch>
+                  </pic:blipFill>
+                  <pic:spPr>
+                    <a:xfrm>
+                      <a:off x="0" y="0"/>
+                      <a:ext cx="5029200" cy="3698118"/>
+                    </a:xfrm>
+                    <a:prstGeom prst="rect">
+                      <a:avLst/>
+                    </a:prstGeom>
+                  </pic:spPr>
+                </pic:pic>
+              </a:graphicData>
+            </a:graphic>
+          </wp:inline>
+        </w:drawing>
       </w:r>
     </w:p>
     <w:p>
       <w:pPr>
         <w:pStyle w:val="BodyText"/>
+        <w:spacing w:after="60"/>
+      </w:pPr>
+      <w:r>
+        <w:rPr>
+          <w:i/>
+          <w:color w:val="595959"/>
+        </w:rPr>
+        <w:t>Figure 1. The Email Order Acknowledgment window. The Subject box (outlined) is the only part of it this rule affects.</w:t>
+      </w:r>
+    </w:p>
+    <w:p>
+      <w:pPr>
+        <w:pStyle w:val="BodyText"/>
       </w:pPr>
     </w:p>
     <w:p>
@@ -3237,7 +3216,7 @@
       <w:pPr>
         <w:pStyle w:val="Heading3"/>
       </w:pPr>
-      <w:bookmarkStart w:id="9" w:name="_Toc241743592"/>
+      <w:bookmarkStart w:id="9" w:name="_Toc242784034"/>
       <w:r>
         <w:t>What the rule does</w:t>
       </w:r>
@@ -3272,7 +3251,20 @@
         <w:pStyle w:val="BodyText"/>
       </w:pPr>
       <w:r>
-        <w:t>This is the most important rule in the design. The space in a subject line is limited and shared, so anything the rule added to a subject somebody had already written would have to push their words aside. Standing back avoids that entirely, and means the full space is available on the occasions when the rule does act. About one acknowledgment in three is sent with something typed in the subject, and every one of those is left untouched.</w:t>
+        <w:lastRenderedPageBreak/>
+        <w:t xml:space="preserve">This is the most important rule in </w:t>
+      </w:r>
+      <w:r>
+        <w:t>this design</w:t>
+      </w:r>
+      <w:r>
+        <w:t xml:space="preserve">. The space in a subject line is limited and shared, so anything the rule added to a subject somebody </w:t>
+      </w:r>
+      <w:r>
+        <w:t>has</w:t>
+      </w:r>
+      <w:r>
+        <w:t xml:space="preserve"> already written would have to push their words aside. Standing back avoids that entirely, and means the full space is available on the occasions when the rule does act. About one acknowledgment in three is sent with something typed in the subject, and every one of those is left untouched.</w:t>
       </w:r>
     </w:p>
     <w:p>
@@ -3288,7 +3280,13 @@
         <w:pStyle w:val="BodyText"/>
       </w:pPr>
       <w:r>
-        <w:t>Where the order has a PO number it is added, exactly as it was entered. It is the customer own reference and the thing they are most likely to search their mailbox for, so it is not altered in any way.</w:t>
+        <w:t xml:space="preserve">Where the order has a PO number it is added, exactly as it was entered. It is the </w:t>
+      </w:r>
+      <w:r>
+        <w:t>customer’s</w:t>
+      </w:r>
+      <w:r>
+        <w:t xml:space="preserve"> own reference and the thing they are most likely to search their mailbox for, so it is not altered in any way.</w:t>
       </w:r>
     </w:p>
     <w:p>
@@ -3332,7 +3330,13 @@
         <w:t xml:space="preserve">Not suitable for a customer. </w:t>
       </w:r>
       <w:r>
-        <w:t>A Sidemark containing wording from an agreed list is left out altogether. The list covers bad language, internal notes, and wording that would tell a customer we had made a mistake. The list itself still has to be agreed; see Open Issues.</w:t>
+        <w:t xml:space="preserve">A Sidemark containing wording from an agreed list is left out altogether. The list covers bad language, internal notes, and wording that would tell a customer we had made a mistake. A sample is in the Appendix. The list itself still must be agreed; see Open Issues. The list works from known wording, so it cannot be assumed to catch everything; the other </w:t>
+      </w:r>
+      <w:r>
+        <w:t>safeguards and</w:t>
+      </w:r>
+      <w:r>
+        <w:t xml:space="preserve"> standing back whenever someone has typed their own subject, reduce the risk independently of the list.</w:t>
       </w:r>
     </w:p>
     <w:p>
@@ -3343,7 +3347,6 @@
         <w:rPr>
           <w:b/>
         </w:rPr>
-        <w:lastRenderedPageBreak/>
         <w:t xml:space="preserve">Too long. </w:t>
       </w:r>
       <w:r>
@@ -3363,7 +3366,29 @@
         <w:pStyle w:val="BodyText"/>
       </w:pPr>
       <w:r>
-        <w:t>If anything at all goes wrong, the rule makes no change and the email sends exactly as it would have done without it. Nothing about this feature can stop somebody emailing a customer.</w:t>
+        <w:t xml:space="preserve">If anything at all goes wrong, the rule makes no </w:t>
+      </w:r>
+      <w:r>
+        <w:t>change,</w:t>
+      </w:r>
+      <w:r>
+        <w:t xml:space="preserve"> and the email sends exactly as it would have done without it. Nothing about this feature can stop somebody emailing a customer.</w:t>
+      </w:r>
+    </w:p>
+    <w:p>
+      <w:pPr>
+        <w:pStyle w:val="Heading4"/>
+      </w:pPr>
+      <w:r>
+        <w:t>Rule 5 - Does not apply to orders from location 281</w:t>
+      </w:r>
+    </w:p>
+    <w:p>
+      <w:pPr>
+        <w:pStyle w:val="BodyText"/>
+      </w:pPr>
+      <w:r>
+        <w:t>If the order's source location is 281, the rule does nothing, whether or not the sender has typed a subject. No PO number or Sidemark is added, and the email sends exactly as it does today. This check is made before any of the other rules, so none of them apply to these orders.</w:t>
       </w:r>
     </w:p>
     <w:p>
@@ -3375,7 +3400,7 @@
       <w:pPr>
         <w:pStyle w:val="Heading3"/>
       </w:pPr>
-      <w:bookmarkStart w:id="10" w:name="_Toc241743593"/>
+      <w:bookmarkStart w:id="10" w:name="_Toc242784035"/>
       <w:r>
         <w:t>Examples</w:t>
       </w:r>
@@ -3416,6 +3441,7 @@
           <w:p>
             <w:pPr>
               <w:pStyle w:val="TableHeading"/>
+              <w:keepNext/>
               <w:rPr>
                 <w:sz w:val="18"/>
               </w:rPr>
@@ -3435,6 +3461,7 @@
           <w:p>
             <w:pPr>
               <w:pStyle w:val="TableHeading"/>
+              <w:keepNext/>
               <w:rPr>
                 <w:sz w:val="18"/>
               </w:rPr>
@@ -3454,6 +3481,7 @@
           <w:p>
             <w:pPr>
               <w:pStyle w:val="TableHeading"/>
+              <w:keepNext/>
               <w:rPr>
                 <w:sz w:val="18"/>
               </w:rPr>
@@ -3478,6 +3506,7 @@
           <w:p>
             <w:pPr>
               <w:pStyle w:val="TableText"/>
+              <w:keepNext/>
               <w:rPr>
                 <w:sz w:val="18"/>
               </w:rPr>
@@ -3497,6 +3526,7 @@
           <w:p>
             <w:pPr>
               <w:pStyle w:val="TableText"/>
+              <w:keepNext/>
               <w:rPr>
                 <w:sz w:val="18"/>
               </w:rPr>
@@ -3516,6 +3546,7 @@
           <w:p>
             <w:pPr>
               <w:pStyle w:val="TableText"/>
+              <w:keepNext/>
               <w:rPr>
                 <w:sz w:val="18"/>
               </w:rPr>
@@ -3540,6 +3571,7 @@
           <w:p>
             <w:pPr>
               <w:pStyle w:val="TableText"/>
+              <w:keepNext/>
               <w:rPr>
                 <w:sz w:val="18"/>
               </w:rPr>
@@ -3559,6 +3591,7 @@
           <w:p>
             <w:pPr>
               <w:pStyle w:val="TableText"/>
+              <w:keepNext/>
               <w:rPr>
                 <w:sz w:val="18"/>
               </w:rPr>
@@ -3578,6 +3611,7 @@
           <w:p>
             <w:pPr>
               <w:pStyle w:val="TableText"/>
+              <w:keepNext/>
               <w:rPr>
                 <w:sz w:val="18"/>
               </w:rPr>
@@ -3602,6 +3636,7 @@
           <w:p>
             <w:pPr>
               <w:pStyle w:val="TableText"/>
+              <w:keepNext/>
               <w:rPr>
                 <w:sz w:val="18"/>
               </w:rPr>
@@ -3621,6 +3656,7 @@
           <w:p>
             <w:pPr>
               <w:pStyle w:val="TableText"/>
+              <w:keepNext/>
               <w:rPr>
                 <w:sz w:val="18"/>
               </w:rPr>
@@ -3640,6 +3676,7 @@
           <w:p>
             <w:pPr>
               <w:pStyle w:val="TableText"/>
+              <w:keepNext/>
               <w:rPr>
                 <w:sz w:val="18"/>
               </w:rPr>
@@ -3664,6 +3701,7 @@
           <w:p>
             <w:pPr>
               <w:pStyle w:val="TableText"/>
+              <w:keepNext/>
               <w:rPr>
                 <w:sz w:val="18"/>
               </w:rPr>
@@ -3683,6 +3721,7 @@
           <w:p>
             <w:pPr>
               <w:pStyle w:val="TableText"/>
+              <w:keepNext/>
               <w:rPr>
                 <w:sz w:val="18"/>
               </w:rPr>
@@ -3702,6 +3741,7 @@
           <w:p>
             <w:pPr>
               <w:pStyle w:val="TableText"/>
+              <w:keepNext/>
               <w:rPr>
                 <w:sz w:val="18"/>
               </w:rPr>
@@ -3726,6 +3766,7 @@
           <w:p>
             <w:pPr>
               <w:pStyle w:val="TableText"/>
+              <w:keepNext/>
               <w:rPr>
                 <w:sz w:val="18"/>
               </w:rPr>
@@ -3745,6 +3786,7 @@
           <w:p>
             <w:pPr>
               <w:pStyle w:val="TableText"/>
+              <w:keepNext/>
               <w:rPr>
                 <w:sz w:val="18"/>
               </w:rPr>
@@ -3764,6 +3806,7 @@
           <w:p>
             <w:pPr>
               <w:pStyle w:val="TableText"/>
+              <w:keepNext/>
               <w:rPr>
                 <w:sz w:val="18"/>
               </w:rPr>
@@ -3788,6 +3831,7 @@
           <w:p>
             <w:pPr>
               <w:pStyle w:val="TableText"/>
+              <w:keepNext/>
               <w:rPr>
                 <w:sz w:val="18"/>
               </w:rPr>
@@ -3807,6 +3851,7 @@
           <w:p>
             <w:pPr>
               <w:pStyle w:val="TableText"/>
+              <w:keepNext/>
               <w:rPr>
                 <w:sz w:val="18"/>
               </w:rPr>
@@ -3826,6 +3871,7 @@
           <w:p>
             <w:pPr>
               <w:pStyle w:val="TableText"/>
+              <w:keepNext/>
               <w:rPr>
                 <w:sz w:val="18"/>
               </w:rPr>
@@ -3835,96 +3881,6 @@
                 <w:sz w:val="18"/>
               </w:rPr>
               <w:t>All Surfaces - Acknowledgement# 6109021</w:t>
-            </w:r>
-          </w:p>
-        </w:tc>
-      </w:tr>
-    </w:tbl>
-    <w:p>
-      <w:pPr>
-        <w:pStyle w:val="Heading3Bar"/>
-      </w:pPr>
-    </w:p>
-    <w:p>
-      <w:pPr>
-        <w:pStyle w:val="Heading3"/>
-      </w:pPr>
-      <w:bookmarkStart w:id="11" w:name="_Toc241743594"/>
-      <w:r>
-        <w:t>What this would mean in practice</w:t>
-      </w:r>
-      <w:bookmarkEnd w:id="11"/>
-    </w:p>
-    <w:p>
-      <w:pPr>
-        <w:pStyle w:val="BodyText"/>
-      </w:pPr>
-      <w:r>
-        <w:t>The rules above were checked against every Order Acknowledgment emailed during 2026, using what was actually typed in each one.</w:t>
-      </w:r>
-    </w:p>
-    <w:tbl>
-      <w:tblPr>
-        <w:tblW w:w="9800" w:type="dxa"/>
-        <w:tblBorders>
-          <w:top w:val="single" w:sz="6" w:space="0" w:color="auto"/>
-          <w:left w:val="single" w:sz="6" w:space="0" w:color="auto"/>
-          <w:bottom w:val="single" w:sz="6" w:space="0" w:color="auto"/>
-          <w:right w:val="single" w:sz="6" w:space="0" w:color="auto"/>
-          <w:insideH w:val="single" w:sz="4" w:space="0" w:color="auto"/>
-          <w:insideV w:val="single" w:sz="4" w:space="0" w:color="auto"/>
-        </w:tblBorders>
-        <w:tblLayout w:type="fixed"/>
-        <w:tblCellMar>
-          <w:left w:w="96" w:type="dxa"/>
-          <w:right w:w="96" w:type="dxa"/>
-        </w:tblCellMar>
-        <w:tblLook w:val="04A0" w:firstRow="1" w:lastRow="0" w:firstColumn="1" w:lastColumn="0" w:noHBand="0" w:noVBand="1"/>
-      </w:tblPr>
-      <w:tblGrid>
-        <w:gridCol w:w="6800"/>
-        <w:gridCol w:w="3000"/>
-      </w:tblGrid>
-      <w:tr>
-        <w:trPr>
-          <w:cantSplit/>
-          <w:tblHeader/>
-        </w:trPr>
-        <w:tc>
-          <w:tcPr>
-            <w:tcW w:w="6800" w:type="dxa"/>
-          </w:tcPr>
-          <w:p>
-            <w:pPr>
-              <w:pStyle w:val="TableHeading"/>
-              <w:rPr>
-                <w:sz w:val="18"/>
-              </w:rPr>
-            </w:pPr>
-            <w:r>
-              <w:rPr>
-                <w:sz w:val="18"/>
-              </w:rPr>
-              <w:t>Outcome</w:t>
-            </w:r>
-          </w:p>
-        </w:tc>
-        <w:tc>
-          <w:tcPr>
-            <w:tcW w:w="3000" w:type="dxa"/>
-          </w:tcPr>
-          <w:p>
-            <w:pPr>
-              <w:pStyle w:val="TableHeading"/>
-              <w:rPr>
-                <w:sz w:val="18"/>
-              </w:rPr>
-            </w:pPr>
-            <w:r>
-              <w:rPr>
-                <w:sz w:val="18"/>
-              </w:rPr>
-              <w:t>Share of acknowledgments</w:t>
             </w:r>
           </w:p>
         </w:tc>
@@ -3935,340 +3891,58 @@
         </w:trPr>
         <w:tc>
           <w:tcPr>
-            <w:tcW w:w="6800" w:type="dxa"/>
-          </w:tcPr>
-          <w:p>
-            <w:pPr>
-              <w:pStyle w:val="TableText"/>
-              <w:rPr>
-                <w:sz w:val="18"/>
-              </w:rPr>
-            </w:pPr>
-            <w:r>
-              <w:rPr>
-                <w:sz w:val="18"/>
-              </w:rPr>
-              <w:t>Sender had typed a subject, so nothing changes</w:t>
-            </w:r>
-          </w:p>
-        </w:tc>
-        <w:tc>
-          <w:tcPr>
-            <w:tcW w:w="3000" w:type="dxa"/>
-          </w:tcPr>
-          <w:p>
-            <w:pPr>
-              <w:pStyle w:val="TableText"/>
-              <w:rPr>
-                <w:sz w:val="18"/>
-              </w:rPr>
-            </w:pPr>
-            <w:r>
-              <w:rPr>
-                <w:sz w:val="18"/>
-              </w:rPr>
-              <w:t>33.3%</w:t>
-            </w:r>
-          </w:p>
-        </w:tc>
-      </w:tr>
-      <w:tr>
-        <w:trPr>
-          <w:cantSplit/>
-        </w:trPr>
-        <w:tc>
-          <w:tcPr>
-            <w:tcW w:w="6800" w:type="dxa"/>
-          </w:tcPr>
-          <w:p>
-            <w:pPr>
-              <w:pStyle w:val="TableText"/>
-              <w:rPr>
-                <w:sz w:val="18"/>
-              </w:rPr>
-            </w:pPr>
-            <w:r>
-              <w:rPr>
-                <w:sz w:val="18"/>
-              </w:rPr>
-              <w:t>Subject was blank, so the rule fills it in</w:t>
-            </w:r>
-          </w:p>
-        </w:tc>
-        <w:tc>
-          <w:tcPr>
-            <w:tcW w:w="3000" w:type="dxa"/>
-          </w:tcPr>
-          <w:p>
-            <w:pPr>
-              <w:pStyle w:val="TableText"/>
-              <w:rPr>
-                <w:sz w:val="18"/>
-              </w:rPr>
-            </w:pPr>
-            <w:r>
-              <w:rPr>
-                <w:sz w:val="18"/>
-              </w:rPr>
-              <w:t>66.7%</w:t>
-            </w:r>
-          </w:p>
-        </w:tc>
-      </w:tr>
-      <w:tr>
-        <w:trPr>
-          <w:cantSplit/>
-        </w:trPr>
-        <w:tc>
-          <w:tcPr>
-            <w:tcW w:w="6800" w:type="dxa"/>
-          </w:tcPr>
-          <w:p>
-            <w:pPr>
-              <w:pStyle w:val="TableText"/>
-              <w:rPr>
-                <w:sz w:val="18"/>
-              </w:rPr>
-            </w:pPr>
-            <w:r>
-              <w:rPr>
-                <w:sz w:val="18"/>
-              </w:rPr>
-              <w:t>Of those, PO and Sidemark both shown</w:t>
-            </w:r>
-          </w:p>
-        </w:tc>
-        <w:tc>
-          <w:tcPr>
-            <w:tcW w:w="3000" w:type="dxa"/>
-          </w:tcPr>
-          <w:p>
-            <w:pPr>
-              <w:pStyle w:val="TableText"/>
-              <w:rPr>
-                <w:sz w:val="18"/>
-              </w:rPr>
-            </w:pPr>
-            <w:r>
-              <w:rPr>
-                <w:sz w:val="18"/>
-              </w:rPr>
-              <w:t>81.3%</w:t>
-            </w:r>
-          </w:p>
-        </w:tc>
-      </w:tr>
-      <w:tr>
-        <w:trPr>
-          <w:cantSplit/>
-        </w:trPr>
-        <w:tc>
-          <w:tcPr>
-            <w:tcW w:w="6800" w:type="dxa"/>
-          </w:tcPr>
-          <w:p>
-            <w:pPr>
-              <w:pStyle w:val="TableText"/>
-              <w:rPr>
-                <w:sz w:val="18"/>
-              </w:rPr>
-            </w:pPr>
-            <w:r>
-              <w:rPr>
-                <w:sz w:val="18"/>
-              </w:rPr>
-              <w:t>Of those, PO shown on its own</w:t>
-            </w:r>
-          </w:p>
-        </w:tc>
-        <w:tc>
-          <w:tcPr>
-            <w:tcW w:w="3000" w:type="dxa"/>
-          </w:tcPr>
-          <w:p>
-            <w:pPr>
-              <w:pStyle w:val="TableText"/>
-              <w:rPr>
-                <w:sz w:val="18"/>
-              </w:rPr>
-            </w:pPr>
-            <w:r>
-              <w:rPr>
-                <w:sz w:val="18"/>
-              </w:rPr>
-              <w:t>14.8%</w:t>
-            </w:r>
-          </w:p>
-        </w:tc>
-      </w:tr>
-      <w:tr>
-        <w:trPr>
-          <w:cantSplit/>
-        </w:trPr>
-        <w:tc>
-          <w:tcPr>
-            <w:tcW w:w="6800" w:type="dxa"/>
-          </w:tcPr>
-          <w:p>
-            <w:pPr>
-              <w:pStyle w:val="TableText"/>
-              <w:rPr>
-                <w:sz w:val="18"/>
-              </w:rPr>
-            </w:pPr>
-            <w:r>
-              <w:rPr>
-                <w:sz w:val="18"/>
-              </w:rPr>
-              <w:t>Of those, nothing suitable to show</w:t>
-            </w:r>
-          </w:p>
-        </w:tc>
-        <w:tc>
-          <w:tcPr>
-            <w:tcW w:w="3000" w:type="dxa"/>
-          </w:tcPr>
-          <w:p>
-            <w:pPr>
-              <w:pStyle w:val="TableText"/>
-              <w:rPr>
-                <w:sz w:val="18"/>
-              </w:rPr>
-            </w:pPr>
-            <w:r>
-              <w:rPr>
-                <w:sz w:val="18"/>
-              </w:rPr>
-              <w:t>3.1%</w:t>
-            </w:r>
-          </w:p>
-        </w:tc>
-      </w:tr>
-      <w:tr>
-        <w:trPr>
-          <w:cantSplit/>
-        </w:trPr>
-        <w:tc>
-          <w:tcPr>
-            <w:tcW w:w="6800" w:type="dxa"/>
-          </w:tcPr>
-          <w:p>
-            <w:pPr>
-              <w:pStyle w:val="TableText"/>
-              <w:rPr>
-                <w:sz w:val="18"/>
-              </w:rPr>
-            </w:pPr>
-            <w:r>
-              <w:rPr>
-                <w:sz w:val="18"/>
-              </w:rPr>
-              <w:t>Sidemark left out for being too short</w:t>
-            </w:r>
-          </w:p>
-        </w:tc>
-        <w:tc>
-          <w:tcPr>
-            <w:tcW w:w="3000" w:type="dxa"/>
-          </w:tcPr>
-          <w:p>
-            <w:pPr>
-              <w:pStyle w:val="TableText"/>
-              <w:rPr>
-                <w:sz w:val="18"/>
-              </w:rPr>
-            </w:pPr>
-            <w:r>
-              <w:rPr>
-                <w:sz w:val="18"/>
-              </w:rPr>
-              <w:t>2.1%</w:t>
-            </w:r>
-          </w:p>
-        </w:tc>
-      </w:tr>
-      <w:tr>
-        <w:trPr>
-          <w:cantSplit/>
-        </w:trPr>
-        <w:tc>
-          <w:tcPr>
-            <w:tcW w:w="6800" w:type="dxa"/>
-          </w:tcPr>
-          <w:p>
-            <w:pPr>
-              <w:pStyle w:val="TableText"/>
-              <w:rPr>
-                <w:sz w:val="18"/>
-              </w:rPr>
-            </w:pPr>
-            <w:r>
-              <w:rPr>
-                <w:sz w:val="18"/>
-              </w:rPr>
-              <w:t>Sidemark left out as unsuitable</w:t>
-            </w:r>
-          </w:p>
-        </w:tc>
-        <w:tc>
-          <w:tcPr>
-            <w:tcW w:w="3000" w:type="dxa"/>
-          </w:tcPr>
-          <w:p>
-            <w:pPr>
-              <w:pStyle w:val="TableText"/>
-              <w:rPr>
-                <w:sz w:val="18"/>
-              </w:rPr>
-            </w:pPr>
-            <w:r>
-              <w:rPr>
-                <w:sz w:val="18"/>
-              </w:rPr>
-              <w:t>0.3%</w:t>
-            </w:r>
-          </w:p>
-        </w:tc>
-      </w:tr>
-      <w:tr>
-        <w:trPr>
-          <w:cantSplit/>
-        </w:trPr>
-        <w:tc>
-          <w:tcPr>
-            <w:tcW w:w="6800" w:type="dxa"/>
-          </w:tcPr>
-          <w:p>
-            <w:pPr>
-              <w:pStyle w:val="TableText"/>
-              <w:rPr>
-                <w:sz w:val="18"/>
-              </w:rPr>
-            </w:pPr>
-            <w:r>
-              <w:rPr>
-                <w:sz w:val="18"/>
-              </w:rPr>
-              <w:t>Sidemark shortened to fit</w:t>
-            </w:r>
-          </w:p>
-        </w:tc>
-        <w:tc>
-          <w:tcPr>
-            <w:tcW w:w="3000" w:type="dxa"/>
-          </w:tcPr>
-          <w:p>
-            <w:pPr>
-              <w:pStyle w:val="TableText"/>
-              <w:rPr>
-                <w:sz w:val="18"/>
-              </w:rPr>
-            </w:pPr>
-            <w:r>
-              <w:rPr>
-                <w:sz w:val="18"/>
-              </w:rPr>
-              <w:t>1.2%</w:t>
+            <w:tcW w:w="2400" w:type="dxa"/>
+          </w:tcPr>
+          <w:p>
+            <w:pPr>
+              <w:pStyle w:val="TableText"/>
+              <w:rPr>
+                <w:sz w:val="18"/>
+              </w:rPr>
+            </w:pPr>
+            <w:r>
+              <w:rPr>
+                <w:sz w:val="18"/>
+              </w:rPr>
+              <w:t>Order's source location is 281</w:t>
+            </w:r>
+          </w:p>
+        </w:tc>
+        <w:tc>
+          <w:tcPr>
+            <w:tcW w:w="1600" w:type="dxa"/>
+          </w:tcPr>
+          <w:p>
+            <w:pPr>
+              <w:pStyle w:val="TableText"/>
+              <w:rPr>
+                <w:sz w:val="18"/>
+              </w:rPr>
+            </w:pPr>
+            <w:r>
+              <w:rPr>
+                <w:sz w:val="18"/>
+              </w:rPr>
+              <w:t>(nothing)</w:t>
+            </w:r>
+          </w:p>
+        </w:tc>
+        <w:tc>
+          <w:tcPr>
+            <w:tcW w:w="5800" w:type="dxa"/>
+          </w:tcPr>
+          <w:p>
+            <w:pPr>
+              <w:pStyle w:val="TableText"/>
+              <w:rPr>
+                <w:sz w:val="18"/>
+              </w:rPr>
+            </w:pPr>
+            <w:r>
+              <w:rPr>
+                <w:sz w:val="18"/>
+              </w:rPr>
+              <w:t>All Surfaces - Acknowledgement# 6109021</w:t>
             </w:r>
           </w:p>
         </w:tc>
@@ -4276,22 +3950,8 @@
     </w:tbl>
     <w:p>
       <w:pPr>
-        <w:pStyle w:val="BodyText"/>
-      </w:pPr>
-    </w:p>
-    <w:p>
-      <w:pPr>
-        <w:pStyle w:val="BodyText"/>
-      </w:pPr>
-      <w:r>
-        <w:rPr>
-          <w:b/>
-        </w:rPr>
-        <w:t xml:space="preserve">One limitation worth knowing. </w:t>
-      </w:r>
-      <w:r>
-        <w:t>The unsuitable-wording check works from a list, so it finds what it has been told to find. There are more than a hundred thousand different Sidemarks in use and most appear on only one order, so the list cannot be assumed to catch everything. The other two safeguards, and standing back whenever somebody has typed their own subject, each reduce the risk independently of the list.</w:t>
-      </w:r>
+        <w:pStyle w:val="Heading3Bar"/>
+      </w:pPr>
     </w:p>
     <w:p>
       <w:r>
@@ -4302,35 +3962,35 @@
       <w:pPr>
         <w:pStyle w:val="Heading2"/>
       </w:pPr>
-      <w:bookmarkStart w:id="12" w:name="_Toc241743595"/>
+      <w:bookmarkStart w:id="11" w:name="_Toc242784036"/>
       <w:r>
         <w:lastRenderedPageBreak/>
         <w:t>Testing Approach</w:t>
       </w:r>
+      <w:bookmarkEnd w:id="11"/>
+    </w:p>
+    <w:p>
+      <w:pPr>
+        <w:pStyle w:val="BodyText"/>
+      </w:pPr>
+      <w:r>
+        <w:t>Testing is carried out in two stages, in two separate environments. Nothing goes live until both are complete.</w:t>
+      </w:r>
+    </w:p>
+    <w:p>
+      <w:pPr>
+        <w:pStyle w:val="HeadingBar"/>
+      </w:pPr>
+    </w:p>
+    <w:p>
+      <w:pPr>
+        <w:pStyle w:val="Heading3"/>
+      </w:pPr>
+      <w:bookmarkStart w:id="12" w:name="_Toc242784037"/>
+      <w:r>
+        <w:t>Environments</w:t>
+      </w:r>
       <w:bookmarkEnd w:id="12"/>
-    </w:p>
-    <w:p>
-      <w:pPr>
-        <w:pStyle w:val="BodyText"/>
-      </w:pPr>
-      <w:r>
-        <w:t>Testing is carried out in two stages, in two separate environments. Nothing goes live until both are complete.</w:t>
-      </w:r>
-    </w:p>
-    <w:p>
-      <w:pPr>
-        <w:pStyle w:val="HeadingBar"/>
-      </w:pPr>
-    </w:p>
-    <w:p>
-      <w:pPr>
-        <w:pStyle w:val="Heading3"/>
-      </w:pPr>
-      <w:bookmarkStart w:id="13" w:name="_Toc241743596"/>
-      <w:r>
-        <w:t>Environments</w:t>
-      </w:r>
-      <w:bookmarkEnd w:id="13"/>
     </w:p>
     <w:tbl>
       <w:tblPr>
@@ -4614,11 +4274,14 @@
       <w:pPr>
         <w:pStyle w:val="Heading3"/>
       </w:pPr>
-      <w:bookmarkStart w:id="14" w:name="_Toc241743597"/>
-      <w:r>
-        <w:t>Precaution that applies to both test environments</w:t>
-      </w:r>
-      <w:bookmarkEnd w:id="14"/>
+      <w:bookmarkStart w:id="13" w:name="_Toc242784038"/>
+      <w:r>
+        <w:t>Precautions that apply</w:t>
+      </w:r>
+      <w:r>
+        <w:t xml:space="preserve"> to both test environments</w:t>
+      </w:r>
+      <w:bookmarkEnd w:id="13"/>
     </w:p>
     <w:p>
       <w:pPr>
@@ -4628,10 +4291,10 @@
         <w:rPr>
           <w:b/>
         </w:rPr>
-        <w:t xml:space="preserve">Both test environments hold real customer data and can send real email. </w:t>
-      </w:r>
-      <w:r>
-        <w:t>A test send will reach an actual customer unless the address is changed first. This has happened before on this piece of work: in July 2026 four real customers received a test message from a test environment.</w:t>
+        <w:t>All test emails are sent to internal users only.</w:t>
+      </w:r>
+      <w:r>
+        <w:t xml:space="preserve"> Both test environments hold real customer data and can send real email, so the tester must make sure the To address is their own before clicking Send.</w:t>
       </w:r>
     </w:p>
     <w:p>
@@ -4642,14 +4305,37 @@
     <w:p>
       <w:pPr>
         <w:pStyle w:val="Bullet1"/>
-      </w:pPr>
-      <w:r>
-        <w:t>The To address must be changed to the tester before Send is clicked, on every test, without exception.</w:t>
+        <w:numPr>
+          <w:ilvl w:val="0"/>
+          <w:numId w:val="23"/>
+        </w:numPr>
+        <w:spacing w:after="60"/>
+      </w:pPr>
+      <w:r>
+        <w:t>The To address must be the tester’s own email address before Send is clicked, on every test, without exception.</w:t>
       </w:r>
     </w:p>
     <w:p>
       <w:pPr>
         <w:pStyle w:val="Bullet1"/>
+        <w:numPr>
+          <w:ilvl w:val="0"/>
+          <w:numId w:val="23"/>
+        </w:numPr>
+        <w:spacing w:after="60"/>
+      </w:pPr>
+      <w:r>
+        <w:t>The body of every test email (the Memo box) must read: “This is a test email - take no action.”</w:t>
+      </w:r>
+    </w:p>
+    <w:p>
+      <w:pPr>
+        <w:pStyle w:val="Bullet1"/>
+        <w:numPr>
+          <w:ilvl w:val="0"/>
+          <w:numId w:val="23"/>
+        </w:numPr>
+        <w:spacing w:after="60"/>
       </w:pPr>
       <w:r>
         <w:t>Each result is checked against the email that actually arrives, not only against the system record of what the rule did.</w:t>
@@ -4658,17 +4344,18 @@
     <w:p>
       <w:pPr>
         <w:pStyle w:val="Heading3Bar"/>
+        <w:pageBreakBefore/>
       </w:pPr>
     </w:p>
     <w:p>
       <w:pPr>
         <w:pStyle w:val="Heading3"/>
       </w:pPr>
-      <w:bookmarkStart w:id="15" w:name="_Toc241743598"/>
+      <w:bookmarkStart w:id="14" w:name="_Toc242784039"/>
       <w:r>
         <w:t>Test Cases</w:t>
       </w:r>
-      <w:bookmarkEnd w:id="15"/>
+      <w:bookmarkEnd w:id="14"/>
     </w:p>
     <w:p>
       <w:pPr>
@@ -5470,7 +5157,7 @@
               <w:rPr>
                 <w:sz w:val="18"/>
               </w:rPr>
-              <w:t>The marketing message already added to the email body</w:t>
+              <w:t>Longest possible subject</w:t>
             </w:r>
           </w:p>
         </w:tc>
@@ -5489,7 +5176,7 @@
               <w:rPr>
                 <w:sz w:val="18"/>
               </w:rPr>
-              <w:t>reuse case 1</w:t>
+              <w:t>reuse case 5</w:t>
             </w:r>
           </w:p>
         </w:tc>
@@ -5508,7 +5195,7 @@
               <w:rPr>
                 <w:sz w:val="18"/>
               </w:rPr>
-              <w:t>On a single email, both the subject line and the existing marketing message appear.</w:t>
+              <w:t>Subject is complete and not cut short, and nothing goes wrong when sending.</w:t>
             </w:r>
           </w:p>
         </w:tc>
@@ -5551,7 +5238,7 @@
               <w:rPr>
                 <w:sz w:val="18"/>
               </w:rPr>
-              <w:t>Longest possible subject</w:t>
+              <w:t>Order entered by test user Island2, whose default location is set to 281</w:t>
             </w:r>
           </w:p>
         </w:tc>
@@ -5570,7 +5257,7 @@
               <w:rPr>
                 <w:sz w:val="18"/>
               </w:rPr>
-              <w:t>reuse case 5</w:t>
+              <w:t>new test order</w:t>
             </w:r>
           </w:p>
         </w:tc>
@@ -5589,7 +5276,7 @@
               <w:rPr>
                 <w:sz w:val="18"/>
               </w:rPr>
-              <w:t>Subject is complete and not cut short, and nothing goes wrong when sending.</w:t>
+              <w:t>Email is sent to an internal user. Nothing is added to the subject.</w:t>
             </w:r>
           </w:p>
         </w:tc>
@@ -5602,21 +5289,6 @@
     </w:p>
     <w:p>
       <w:pPr>
-        <w:pStyle w:val="BodyText"/>
-      </w:pPr>
-      <w:r>
-        <w:rPr>
-          <w:b/>
-        </w:rPr>
-        <w:lastRenderedPageBreak/>
-        <w:t xml:space="preserve">Case 9 is not optional. </w:t>
-      </w:r>
-      <w:r>
-        <w:t>A separate feature already adds a marketing message to the body of this same email, and the two share part of their setup. If one is disturbed, both can stop working without any visible sign.</w:t>
-      </w:r>
-    </w:p>
-    <w:p>
-      <w:pPr>
         <w:pStyle w:val="Heading3Bar"/>
       </w:pPr>
     </w:p>
@@ -5624,15 +5296,20 @@
       <w:pPr>
         <w:pStyle w:val="Heading3"/>
       </w:pPr>
-      <w:bookmarkStart w:id="16" w:name="_Toc241743599"/>
+      <w:bookmarkStart w:id="15" w:name="_Toc242784040"/>
       <w:r>
         <w:t>What has to be true before go-live</w:t>
       </w:r>
-      <w:bookmarkEnd w:id="16"/>
+      <w:bookmarkEnd w:id="15"/>
     </w:p>
     <w:p>
       <w:pPr>
         <w:pStyle w:val="Bullet1"/>
+        <w:numPr>
+          <w:ilvl w:val="0"/>
+          <w:numId w:val="23"/>
+        </w:numPr>
+        <w:spacing w:after="60"/>
       </w:pPr>
       <w:r>
         <w:t>All ten cases pass in P21BusinessRules.</w:t>
@@ -5641,6 +5318,11 @@
     <w:p>
       <w:pPr>
         <w:pStyle w:val="Bullet1"/>
+        <w:numPr>
+          <w:ilvl w:val="0"/>
+          <w:numId w:val="23"/>
+        </w:numPr>
+        <w:spacing w:after="60"/>
       </w:pPr>
       <w:r>
         <w:t>All ten cases pass in P21Play, witnessed by a reviewer.</w:t>
@@ -5649,6 +5331,11 @@
     <w:p>
       <w:pPr>
         <w:pStyle w:val="Bullet1"/>
+        <w:numPr>
+          <w:ilvl w:val="0"/>
+          <w:numId w:val="23"/>
+        </w:numPr>
+        <w:spacing w:after="60"/>
       </w:pPr>
       <w:r>
         <w:t>No subject is cut short, and no case prevents an email being sent.</w:t>
@@ -5657,6 +5344,11 @@
     <w:p>
       <w:pPr>
         <w:pStyle w:val="Bullet1"/>
+        <w:numPr>
+          <w:ilvl w:val="0"/>
+          <w:numId w:val="23"/>
+        </w:numPr>
+        <w:spacing w:after="60"/>
       </w:pPr>
       <w:r>
         <w:t>The list of unsuitable wording has been reviewed and agreed.</w:t>
@@ -5665,6 +5357,11 @@
     <w:p>
       <w:pPr>
         <w:pStyle w:val="Bullet1"/>
+        <w:numPr>
+          <w:ilvl w:val="0"/>
+          <w:numId w:val="23"/>
+        </w:numPr>
+        <w:spacing w:after="60"/>
       </w:pPr>
       <w:r>
         <w:t>Written sign-off has been recorded from user acceptance testing.</w:t>
@@ -5679,12 +5376,12 @@
       <w:pPr>
         <w:pStyle w:val="Heading2"/>
       </w:pPr>
-      <w:bookmarkStart w:id="17" w:name="_Toc241743600"/>
+      <w:bookmarkStart w:id="16" w:name="_Toc242784041"/>
       <w:r>
         <w:lastRenderedPageBreak/>
         <w:t>Future Features / Updates / Enhancements</w:t>
       </w:r>
-      <w:bookmarkEnd w:id="17"/>
+      <w:bookmarkEnd w:id="16"/>
     </w:p>
     <w:p>
       <w:pPr>
@@ -5697,6 +5394,11 @@
     <w:p>
       <w:pPr>
         <w:pStyle w:val="Bullet1"/>
+        <w:numPr>
+          <w:ilvl w:val="0"/>
+          <w:numId w:val="23"/>
+        </w:numPr>
+        <w:spacing w:after="60"/>
       </w:pPr>
       <w:r>
         <w:t>Leaving out marketplace accounts, where the PO field holds a marketplace reference that would mean nothing to the person reading the email.</w:t>
@@ -5705,6 +5407,11 @@
     <w:p>
       <w:pPr>
         <w:pStyle w:val="Bullet1"/>
+        <w:numPr>
+          <w:ilvl w:val="0"/>
+          <w:numId w:val="23"/>
+        </w:numPr>
+        <w:spacing w:after="60"/>
       </w:pPr>
       <w:r>
         <w:t>A Sidemark field intended from the start to be shown to customers. The safeguards in this document manage the risk of using a field that was never meant to be seen outside the business, but they do not remove it.</w:t>
@@ -5713,6 +5420,11 @@
     <w:p>
       <w:pPr>
         <w:pStyle w:val="Bullet1"/>
+        <w:numPr>
+          <w:ilvl w:val="0"/>
+          <w:numId w:val="23"/>
+        </w:numPr>
+        <w:spacing w:after="60"/>
       </w:pPr>
       <w:r>
         <w:t>Doing the same for other documents we email, such as invoices.</w:t>
@@ -5721,9 +5433,14 @@
     <w:p>
       <w:pPr>
         <w:pStyle w:val="Bullet1"/>
-      </w:pPr>
-      <w:r>
-        <w:t>Reviewing the unsuitable-wording list and the minimum length after a period of real use, rather than relying on the figures modeled in this document.</w:t>
+        <w:numPr>
+          <w:ilvl w:val="0"/>
+          <w:numId w:val="23"/>
+        </w:numPr>
+        <w:spacing w:after="60"/>
+      </w:pPr>
+      <w:r>
+        <w:t>Reviewing the unsuitable-wording list and the minimum length after a period of real use, rather than relying on the figures modeled from 2026 history.</w:t>
       </w:r>
     </w:p>
     <w:p>
@@ -5735,27 +5452,27 @@
       <w:pPr>
         <w:pStyle w:val="Heading2"/>
       </w:pPr>
-      <w:bookmarkStart w:id="18" w:name="_Toc241743601"/>
+      <w:bookmarkStart w:id="17" w:name="_Toc242784042"/>
       <w:r>
         <w:lastRenderedPageBreak/>
         <w:t>Open / Closed Issues</w:t>
       </w:r>
+      <w:bookmarkEnd w:id="17"/>
+    </w:p>
+    <w:p>
+      <w:pPr>
+        <w:pStyle w:val="Heading3Bar"/>
+      </w:pPr>
+    </w:p>
+    <w:p>
+      <w:pPr>
+        <w:pStyle w:val="Heading3"/>
+      </w:pPr>
+      <w:bookmarkStart w:id="18" w:name="_Toc242784043"/>
+      <w:r>
+        <w:t>Open Issues</w:t>
+      </w:r>
       <w:bookmarkEnd w:id="18"/>
-    </w:p>
-    <w:p>
-      <w:pPr>
-        <w:pStyle w:val="Heading3Bar"/>
-      </w:pPr>
-    </w:p>
-    <w:p>
-      <w:pPr>
-        <w:pStyle w:val="Heading3"/>
-      </w:pPr>
-      <w:bookmarkStart w:id="19" w:name="_Toc241743602"/>
-      <w:r>
-        <w:t>Open Issues</w:t>
-      </w:r>
-      <w:bookmarkEnd w:id="19"/>
     </w:p>
     <w:tbl>
       <w:tblPr>
@@ -5943,7 +5660,7 @@
               <w:rPr>
                 <w:sz w:val="18"/>
               </w:rPr>
-              <w:t>The list of wording that makes a Sidemark unsuitable has not been agreed. A draft exists, but some everyday words also appear in genuine job names and would be caught unnecessarily.</w:t>
+              <w:t>The list of wording that makes a Sidemark unsuitable has not been agreed. A sample is in the Appendix, but some everyday words also appear in genuine job names and would be caught unnecessarily.</w:t>
             </w:r>
           </w:p>
         </w:tc>
@@ -5962,7 +5679,19 @@
               <w:rPr>
                 <w:sz w:val="18"/>
               </w:rPr>
-              <w:t>Business Applications to propose the list, reviewers to agree it.</w:t>
+              <w:t xml:space="preserve">Business Applications to propose the list, reviewers to </w:t>
+            </w:r>
+            <w:r>
+              <w:rPr>
+                <w:sz w:val="18"/>
+              </w:rPr>
+              <w:t>agree with</w:t>
+            </w:r>
+            <w:r>
+              <w:rPr>
+                <w:sz w:val="18"/>
+              </w:rPr>
+              <w:t xml:space="preserve"> it.</w:t>
             </w:r>
           </w:p>
         </w:tc>
@@ -6067,68 +5796,6 @@
               <w:rPr>
                 <w:sz w:val="18"/>
               </w:rPr>
-              <w:t>A separate feature already adds a marketing message to the body of the same email. The two share part of their setup, so a change to one can affect the other.</w:t>
-            </w:r>
-          </w:p>
-        </w:tc>
-        <w:tc>
-          <w:tcPr>
-            <w:tcW w:w="4200" w:type="dxa"/>
-          </w:tcPr>
-          <w:p>
-            <w:pPr>
-              <w:pStyle w:val="TableText"/>
-              <w:rPr>
-                <w:sz w:val="18"/>
-              </w:rPr>
-            </w:pPr>
-            <w:r>
-              <w:rPr>
-                <w:sz w:val="18"/>
-              </w:rPr>
-              <w:t>Covered by test case 9; must pass before go-live.</w:t>
-            </w:r>
-          </w:p>
-        </w:tc>
-      </w:tr>
-      <w:tr>
-        <w:trPr>
-          <w:cantSplit/>
-        </w:trPr>
-        <w:tc>
-          <w:tcPr>
-            <w:tcW w:w="400" w:type="dxa"/>
-          </w:tcPr>
-          <w:p>
-            <w:pPr>
-              <w:pStyle w:val="TableText"/>
-              <w:rPr>
-                <w:sz w:val="18"/>
-              </w:rPr>
-            </w:pPr>
-            <w:r>
-              <w:rPr>
-                <w:sz w:val="18"/>
-              </w:rPr>
-              <w:t>5</w:t>
-            </w:r>
-          </w:p>
-        </w:tc>
-        <w:tc>
-          <w:tcPr>
-            <w:tcW w:w="5200" w:type="dxa"/>
-          </w:tcPr>
-          <w:p>
-            <w:pPr>
-              <w:pStyle w:val="TableText"/>
-              <w:rPr>
-                <w:sz w:val="18"/>
-              </w:rPr>
-            </w:pPr>
-            <w:r>
-              <w:rPr>
-                <w:sz w:val="18"/>
-              </w:rPr>
               <w:t>Whether orders from marketplace accounts should be left out has not been decided.</w:t>
             </w:r>
           </w:p>
@@ -6163,11 +5830,11 @@
       <w:pPr>
         <w:pStyle w:val="Heading3"/>
       </w:pPr>
-      <w:bookmarkStart w:id="20" w:name="_Toc241743603"/>
+      <w:bookmarkStart w:id="19" w:name="_Toc242784044"/>
       <w:r>
         <w:t>Closed Issues</w:t>
       </w:r>
-      <w:bookmarkEnd w:id="20"/>
+      <w:bookmarkEnd w:id="19"/>
     </w:p>
     <w:tbl>
       <w:tblPr>
@@ -6436,7 +6103,7 @@
               <w:rPr>
                 <w:sz w:val="18"/>
               </w:rPr>
-              <w:t>No. This was tried and abandoned. It is not supported and caused the Prophet21 application to close unexpectedly.</w:t>
+              <w:t>No. This was tried and abandoned. It is not supported and caused the P21 application to close unexpectedly.</w:t>
             </w:r>
           </w:p>
         </w:tc>
@@ -6513,48 +6180,19 @@
       <w:pPr>
         <w:pStyle w:val="Heading2"/>
       </w:pPr>
-      <w:bookmarkStart w:id="21" w:name="_Toc241743604"/>
+      <w:bookmarkStart w:id="20" w:name="_Toc242784045"/>
       <w:r>
         <w:lastRenderedPageBreak/>
-        <w:t>Appendix - Technical Reference</w:t>
-      </w:r>
-      <w:bookmarkEnd w:id="21"/>
+        <w:t>Appendix - Sample of Unsuitable Wording</w:t>
+      </w:r>
+      <w:bookmarkEnd w:id="20"/>
     </w:p>
     <w:p>
       <w:pPr>
         <w:pStyle w:val="BodyText"/>
       </w:pPr>
       <w:r>
-        <w:rPr>
-          <w:b/>
-        </w:rPr>
-        <w:t xml:space="preserve">For IT reference only. </w:t>
-      </w:r>
-      <w:r>
-        <w:t>Nothing in this appendix is needed in order to review or approve the behavior described above.</w:t>
-      </w:r>
-    </w:p>
-    <w:p>
-      <w:pPr>
-        <w:pStyle w:val="HeadingBar"/>
-      </w:pPr>
-    </w:p>
-    <w:p>
-      <w:pPr>
-        <w:pStyle w:val="Heading3"/>
-      </w:pPr>
-      <w:bookmarkStart w:id="22" w:name="_Toc241743605"/>
-      <w:r>
-        <w:t>Why two rules are needed</w:t>
-      </w:r>
-      <w:bookmarkEnd w:id="22"/>
-    </w:p>
-    <w:p>
-      <w:pPr>
-        <w:pStyle w:val="BodyText"/>
-      </w:pPr>
-      <w:r>
-        <w:t>The email window (w_email_response) is shared by every emailed document and exposes neither the form type nor the order number. Both are available at the earlier FormPreEmail event (business_rule_event_uid 24), so they are recorded there and read back when the OK button is clicked.</w:t>
+        <w:t>This is a sample, not the final list. It shows the kind of wording that would cause a Sidemark to be left out of the subject line. Reviewers are asked to add, remove or change entries. Explicit language is not reproduced here; it will be included in the list kept by Business Applications.</w:t>
       </w:r>
     </w:p>
     <w:tbl>
@@ -6576,9 +6214,9 @@
         <w:tblLook w:val="04A0" w:firstRow="1" w:lastRow="0" w:firstColumn="1" w:lastColumn="0" w:noHBand="0" w:noVBand="1"/>
       </w:tblPr>
       <w:tblGrid>
-        <w:gridCol w:w="2400"/>
-        <w:gridCol w:w="2600"/>
-        <w:gridCol w:w="4800"/>
+        <w:gridCol w:w="2200"/>
+        <w:gridCol w:w="4300"/>
+        <w:gridCol w:w="3300"/>
       </w:tblGrid>
       <w:tr>
         <w:trPr>
@@ -6587,58 +6225,61 @@
         </w:trPr>
         <w:tc>
           <w:tcPr>
-            <w:tcW w:w="2400" w:type="dxa"/>
+            <w:tcW w:w="2200" w:type="dxa"/>
           </w:tcPr>
           <w:p>
             <w:pPr>
               <w:pStyle w:val="TableHeading"/>
-              <w:rPr>
-                <w:sz w:val="18"/>
-              </w:rPr>
-            </w:pPr>
-            <w:r>
-              <w:rPr>
-                <w:sz w:val="18"/>
-              </w:rPr>
-              <w:t>Component</w:t>
-            </w:r>
-          </w:p>
-        </w:tc>
-        <w:tc>
-          <w:tcPr>
-            <w:tcW w:w="2600" w:type="dxa"/>
+              <w:keepNext/>
+              <w:rPr>
+                <w:sz w:val="18"/>
+              </w:rPr>
+            </w:pPr>
+            <w:r>
+              <w:rPr>
+                <w:sz w:val="18"/>
+              </w:rPr>
+              <w:t>Category</w:t>
+            </w:r>
+          </w:p>
+        </w:tc>
+        <w:tc>
+          <w:tcPr>
+            <w:tcW w:w="4300" w:type="dxa"/>
           </w:tcPr>
           <w:p>
             <w:pPr>
               <w:pStyle w:val="TableHeading"/>
-              <w:rPr>
-                <w:sz w:val="18"/>
-              </w:rPr>
-            </w:pPr>
-            <w:r>
-              <w:rPr>
-                <w:sz w:val="18"/>
-              </w:rPr>
-              <w:t>Type</w:t>
-            </w:r>
-          </w:p>
-        </w:tc>
-        <w:tc>
-          <w:tcPr>
-            <w:tcW w:w="4800" w:type="dxa"/>
+              <w:keepNext/>
+              <w:rPr>
+                <w:sz w:val="18"/>
+              </w:rPr>
+            </w:pPr>
+            <w:r>
+              <w:rPr>
+                <w:sz w:val="18"/>
+              </w:rPr>
+              <w:t>Sample words or phrases</w:t>
+            </w:r>
+          </w:p>
+        </w:tc>
+        <w:tc>
+          <w:tcPr>
+            <w:tcW w:w="3300" w:type="dxa"/>
           </w:tcPr>
           <w:p>
             <w:pPr>
               <w:pStyle w:val="TableHeading"/>
-              <w:rPr>
-                <w:sz w:val="18"/>
-              </w:rPr>
-            </w:pPr>
-            <w:r>
-              <w:rPr>
-                <w:sz w:val="18"/>
-              </w:rPr>
-              <w:t>Purpose</w:t>
+              <w:keepNext/>
+              <w:rPr>
+                <w:sz w:val="18"/>
+              </w:rPr>
+            </w:pPr>
+            <w:r>
+              <w:rPr>
+                <w:sz w:val="18"/>
+              </w:rPr>
+              <w:t>Reviewer note</w:t>
             </w:r>
           </w:p>
         </w:tc>
@@ -6649,58 +6290,61 @@
         </w:trPr>
         <w:tc>
           <w:tcPr>
-            <w:tcW w:w="2400" w:type="dxa"/>
-          </w:tcPr>
-          <w:p>
-            <w:pPr>
-              <w:pStyle w:val="TableText"/>
-              <w:rPr>
-                <w:sz w:val="18"/>
-              </w:rPr>
-            </w:pPr>
-            <w:r>
-              <w:rPr>
-                <w:sz w:val="18"/>
-              </w:rPr>
-              <w:t>asi_email_context_flag</w:t>
-            </w:r>
-          </w:p>
-        </w:tc>
-        <w:tc>
-          <w:tcPr>
-            <w:tcW w:w="2600" w:type="dxa"/>
-          </w:tcPr>
-          <w:p>
-            <w:pPr>
-              <w:pStyle w:val="TableText"/>
-              <w:rPr>
-                <w:sz w:val="18"/>
-              </w:rPr>
-            </w:pPr>
-            <w:r>
-              <w:rPr>
-                <w:sz w:val="18"/>
-              </w:rPr>
-              <w:t>On-Event rule, FormPreEmail</w:t>
-            </w:r>
-          </w:p>
-        </w:tc>
-        <w:tc>
-          <w:tcPr>
-            <w:tcW w:w="4800" w:type="dxa"/>
-          </w:tcPr>
-          <w:p>
-            <w:pPr>
-              <w:pStyle w:val="TableText"/>
-              <w:rPr>
-                <w:sz w:val="18"/>
-              </w:rPr>
-            </w:pPr>
-            <w:r>
-              <w:rPr>
-                <w:sz w:val="18"/>
-              </w:rPr>
-              <w:t>Fires for every emailed document. Writes form_type and document_nos for the current user. Writes on every send so a stale value cannot be read later.</w:t>
+            <w:tcW w:w="2200" w:type="dxa"/>
+          </w:tcPr>
+          <w:p>
+            <w:pPr>
+              <w:pStyle w:val="TableText"/>
+              <w:keepNext/>
+              <w:rPr>
+                <w:sz w:val="18"/>
+              </w:rPr>
+            </w:pPr>
+            <w:r>
+              <w:rPr>
+                <w:sz w:val="18"/>
+              </w:rPr>
+              <w:t>Bad language</w:t>
+            </w:r>
+          </w:p>
+        </w:tc>
+        <w:tc>
+          <w:tcPr>
+            <w:tcW w:w="4300" w:type="dxa"/>
+          </w:tcPr>
+          <w:p>
+            <w:pPr>
+              <w:pStyle w:val="TableText"/>
+              <w:keepNext/>
+              <w:rPr>
+                <w:sz w:val="18"/>
+              </w:rPr>
+            </w:pPr>
+            <w:r>
+              <w:rPr>
+                <w:sz w:val="18"/>
+              </w:rPr>
+              <w:t>damn; crap; stupid; idiot; jerk</w:t>
+            </w:r>
+          </w:p>
+        </w:tc>
+        <w:tc>
+          <w:tcPr>
+            <w:tcW w:w="3300" w:type="dxa"/>
+          </w:tcPr>
+          <w:p>
+            <w:pPr>
+              <w:pStyle w:val="TableText"/>
+              <w:keepNext/>
+              <w:rPr>
+                <w:sz w:val="18"/>
+              </w:rPr>
+            </w:pPr>
+            <w:r>
+              <w:rPr>
+                <w:sz w:val="18"/>
+              </w:rPr>
+              <w:t>Explicit terms are not reproduced in this sample.</w:t>
             </w:r>
           </w:p>
         </w:tc>
@@ -6711,58 +6355,61 @@
         </w:trPr>
         <w:tc>
           <w:tcPr>
-            <w:tcW w:w="2400" w:type="dxa"/>
-          </w:tcPr>
-          <w:p>
-            <w:pPr>
-              <w:pStyle w:val="TableText"/>
-              <w:rPr>
-                <w:sz w:val="18"/>
-              </w:rPr>
-            </w:pPr>
-            <w:r>
-              <w:rPr>
-                <w:sz w:val="18"/>
-              </w:rPr>
-              <w:t>dbo.asi_email_context_flag</w:t>
-            </w:r>
-          </w:p>
-        </w:tc>
-        <w:tc>
-          <w:tcPr>
-            <w:tcW w:w="2600" w:type="dxa"/>
-          </w:tcPr>
-          <w:p>
-            <w:pPr>
-              <w:pStyle w:val="TableText"/>
-              <w:rPr>
-                <w:sz w:val="18"/>
-              </w:rPr>
-            </w:pPr>
-            <w:r>
-              <w:rPr>
-                <w:sz w:val="18"/>
-              </w:rPr>
-              <w:t>SQL table</w:t>
-            </w:r>
-          </w:p>
-        </w:tc>
-        <w:tc>
-          <w:tcPr>
-            <w:tcW w:w="4800" w:type="dxa"/>
-          </w:tcPr>
-          <w:p>
-            <w:pPr>
-              <w:pStyle w:val="TableText"/>
-              <w:rPr>
-                <w:sz w:val="18"/>
-              </w:rPr>
-            </w:pPr>
-            <w:r>
-              <w:rPr>
-                <w:sz w:val="18"/>
-              </w:rPr>
-              <w:t>One row per user_id: is_order_ack, form_type, document_nos, updated_at. Needs SELECT, INSERT and UPDATE for PxxiUser and p21_application_role.</w:t>
+            <w:tcW w:w="2200" w:type="dxa"/>
+          </w:tcPr>
+          <w:p>
+            <w:pPr>
+              <w:pStyle w:val="TableText"/>
+              <w:keepNext/>
+              <w:rPr>
+                <w:sz w:val="18"/>
+              </w:rPr>
+            </w:pPr>
+            <w:r>
+              <w:rPr>
+                <w:sz w:val="18"/>
+              </w:rPr>
+              <w:t>Internal notes about the order</w:t>
+            </w:r>
+          </w:p>
+        </w:tc>
+        <w:tc>
+          <w:tcPr>
+            <w:tcW w:w="4300" w:type="dxa"/>
+          </w:tcPr>
+          <w:p>
+            <w:pPr>
+              <w:pStyle w:val="TableText"/>
+              <w:keepNext/>
+              <w:rPr>
+                <w:sz w:val="18"/>
+              </w:rPr>
+            </w:pPr>
+            <w:r>
+              <w:rPr>
+                <w:sz w:val="18"/>
+              </w:rPr>
+              <w:t>replacement for; remake; redo; reship; call before shipping; do not ship; see notes; per (sales rep name); rush</w:t>
+            </w:r>
+          </w:p>
+        </w:tc>
+        <w:tc>
+          <w:tcPr>
+            <w:tcW w:w="3300" w:type="dxa"/>
+          </w:tcPr>
+          <w:p>
+            <w:pPr>
+              <w:pStyle w:val="TableText"/>
+              <w:keepNext/>
+              <w:rPr>
+                <w:sz w:val="18"/>
+              </w:rPr>
+            </w:pPr>
+            <w:r>
+              <w:rPr>
+                <w:sz w:val="18"/>
+              </w:rPr>
+              <w:t>“Rush” also appears in genuine names, such as a hospital or a street. Reviewers to decide.</w:t>
             </w:r>
           </w:p>
         </w:tc>
@@ -6773,180 +6420,202 @@
         </w:trPr>
         <w:tc>
           <w:tcPr>
-            <w:tcW w:w="2400" w:type="dxa"/>
-          </w:tcPr>
-          <w:p>
-            <w:pPr>
-              <w:pStyle w:val="TableText"/>
-              <w:rPr>
-                <w:sz w:val="18"/>
-              </w:rPr>
-            </w:pPr>
-            <w:r>
-              <w:rPr>
-                <w:sz w:val="18"/>
-              </w:rPr>
-              <w:t>asi_oe_order_ack_email_subject</w:t>
-            </w:r>
-          </w:p>
-        </w:tc>
-        <w:tc>
-          <w:tcPr>
-            <w:tcW w:w="2600" w:type="dxa"/>
-          </w:tcPr>
-          <w:p>
-            <w:pPr>
-              <w:pStyle w:val="TableText"/>
-              <w:rPr>
-                <w:sz w:val="18"/>
-              </w:rPr>
-            </w:pPr>
-            <w:r>
-              <w:rPr>
-                <w:sz w:val="18"/>
-              </w:rPr>
-              <w:t>On-Demand rule, multi-row, cb_ok on w_email_response</w:t>
-            </w:r>
-          </w:p>
-        </w:tc>
-        <w:tc>
-          <w:tcPr>
-            <w:tcW w:w="4800" w:type="dxa"/>
-          </w:tcPr>
-          <w:p>
-            <w:pPr>
-              <w:pStyle w:val="TableText"/>
-              <w:rPr>
-                <w:sz w:val="18"/>
-              </w:rPr>
-            </w:pPr>
-            <w:r>
-              <w:rPr>
-                <w:sz w:val="18"/>
-              </w:rPr>
-              <w:t>Reads the flag row and, where it is an Order Acknowledgment, composes and writes d_dw_email_info.subject.</w:t>
+            <w:tcW w:w="2200" w:type="dxa"/>
+          </w:tcPr>
+          <w:p>
+            <w:pPr>
+              <w:pStyle w:val="TableText"/>
+              <w:keepNext/>
+              <w:rPr>
+                <w:sz w:val="18"/>
+              </w:rPr>
+            </w:pPr>
+            <w:r>
+              <w:rPr>
+                <w:sz w:val="18"/>
+              </w:rPr>
+              <w:t>Wording that admits a mistake</w:t>
+            </w:r>
+          </w:p>
+        </w:tc>
+        <w:tc>
+          <w:tcPr>
+            <w:tcW w:w="4300" w:type="dxa"/>
+          </w:tcPr>
+          <w:p>
+            <w:pPr>
+              <w:pStyle w:val="TableText"/>
+              <w:keepNext/>
+              <w:rPr>
+                <w:sz w:val="18"/>
+              </w:rPr>
+            </w:pPr>
+            <w:r>
+              <w:rPr>
+                <w:sz w:val="18"/>
+              </w:rPr>
+              <w:t>wrong account; wrong material; wrong item; wrong address; entered in error; our mistake; duplicate order</w:t>
+            </w:r>
+          </w:p>
+        </w:tc>
+        <w:tc>
+          <w:tcPr>
+            <w:tcW w:w="3300" w:type="dxa"/>
+          </w:tcPr>
+          <w:p>
+            <w:pPr>
+              <w:pStyle w:val="TableText"/>
+              <w:keepNext/>
+              <w:rPr>
+                <w:sz w:val="18"/>
+              </w:rPr>
+            </w:pPr>
+            <w:r>
+              <w:rPr>
+                <w:sz w:val="18"/>
+              </w:rPr>
+              <w:t>These would tell a customer we made an error.</w:t>
+            </w:r>
+          </w:p>
+        </w:tc>
+      </w:tr>
+      <w:tr>
+        <w:trPr>
+          <w:cantSplit/>
+        </w:trPr>
+        <w:tc>
+          <w:tcPr>
+            <w:tcW w:w="2200" w:type="dxa"/>
+          </w:tcPr>
+          <w:p>
+            <w:pPr>
+              <w:pStyle w:val="TableText"/>
+              <w:keepNext/>
+              <w:rPr>
+                <w:sz w:val="18"/>
+              </w:rPr>
+            </w:pPr>
+            <w:r>
+              <w:rPr>
+                <w:sz w:val="18"/>
+              </w:rPr>
+              <w:t>Credit, returns and payment</w:t>
+            </w:r>
+          </w:p>
+        </w:tc>
+        <w:tc>
+          <w:tcPr>
+            <w:tcW w:w="4300" w:type="dxa"/>
+          </w:tcPr>
+          <w:p>
+            <w:pPr>
+              <w:pStyle w:val="TableText"/>
+              <w:keepNext/>
+              <w:rPr>
+                <w:sz w:val="18"/>
+              </w:rPr>
+            </w:pPr>
+            <w:r>
+              <w:rPr>
+                <w:sz w:val="18"/>
+              </w:rPr>
+              <w:t>credit; credit hold; past due; collections; COD only; return; RMA</w:t>
+            </w:r>
+          </w:p>
+        </w:tc>
+        <w:tc>
+          <w:tcPr>
+            <w:tcW w:w="3300" w:type="dxa"/>
+          </w:tcPr>
+          <w:p>
+            <w:pPr>
+              <w:pStyle w:val="TableText"/>
+              <w:keepNext/>
+              <w:rPr>
+                <w:sz w:val="18"/>
+              </w:rPr>
+            </w:pPr>
+            <w:r>
+              <w:rPr>
+                <w:sz w:val="18"/>
+              </w:rPr>
+              <w:t>“Credit” appears in genuine names, such as a credit union.</w:t>
+            </w:r>
+          </w:p>
+        </w:tc>
+      </w:tr>
+      <w:tr>
+        <w:trPr>
+          <w:cantSplit/>
+        </w:trPr>
+        <w:tc>
+          <w:tcPr>
+            <w:tcW w:w="2200" w:type="dxa"/>
+          </w:tcPr>
+          <w:p>
+            <w:pPr>
+              <w:pStyle w:val="TableText"/>
+              <w:keepNext/>
+              <w:rPr>
+                <w:sz w:val="18"/>
+              </w:rPr>
+            </w:pPr>
+            <w:r>
+              <w:rPr>
+                <w:sz w:val="18"/>
+              </w:rPr>
+              <w:t>Placeholders and testing</w:t>
+            </w:r>
+          </w:p>
+        </w:tc>
+        <w:tc>
+          <w:tcPr>
+            <w:tcW w:w="4300" w:type="dxa"/>
+          </w:tcPr>
+          <w:p>
+            <w:pPr>
+              <w:pStyle w:val="TableText"/>
+              <w:keepNext/>
+              <w:rPr>
+                <w:sz w:val="18"/>
+              </w:rPr>
+            </w:pPr>
+            <w:r>
+              <w:rPr>
+                <w:sz w:val="18"/>
+              </w:rPr>
+              <w:t>test; testing; TBD; N/A; none; unknown; xxx; ???</w:t>
+            </w:r>
+          </w:p>
+        </w:tc>
+        <w:tc>
+          <w:tcPr>
+            <w:tcW w:w="3300" w:type="dxa"/>
+          </w:tcPr>
+          <w:p>
+            <w:pPr>
+              <w:pStyle w:val="TableText"/>
+              <w:keepNext/>
+              <w:rPr>
+                <w:sz w:val="18"/>
+              </w:rPr>
+            </w:pPr>
+            <w:r>
+              <w:rPr>
+                <w:sz w:val="18"/>
+              </w:rPr>
+              <w:t>“Test” appears in some genuine job names.</w:t>
             </w:r>
           </w:p>
         </w:tc>
       </w:tr>
     </w:tbl>
-    <w:p>
-      <w:pPr>
-        <w:pStyle w:val="BodyText"/>
-      </w:pPr>
-    </w:p>
-    <w:p>
-      <w:pPr>
-        <w:pStyle w:val="BodyText"/>
-      </w:pPr>
-      <w:r>
-        <w:t>The table and asi_email_context_flag are shared with SA 53475, which appends the ASAP message to the body of the same email. Both features must be re-tested together after any change to either.</w:t>
-      </w:r>
-    </w:p>
-    <w:p>
-      <w:pPr>
-        <w:pStyle w:val="Heading3Bar"/>
-      </w:pPr>
-    </w:p>
-    <w:p>
-      <w:pPr>
-        <w:pStyle w:val="Heading3"/>
-      </w:pPr>
-      <w:bookmarkStart w:id="23" w:name="_Toc241743606"/>
-      <w:r>
-        <w:t>Field constraints</w:t>
-      </w:r>
-      <w:bookmarkEnd w:id="23"/>
-    </w:p>
-    <w:p>
-      <w:pPr>
-        <w:pStyle w:val="BodyText"/>
-      </w:pPr>
-      <w:r>
-        <w:t>d_dw_email_info.subject is char(60) and holds only the free-text portion. Prophet21 generates the "All Surfaces - Acknowledgement# nnnnnnn" prefix at send time and appends this field; the prefix does not count against the 60 characters. oe_hdr.job_name is varchar(40) and oe_hdr.po_no is varchar(50), both unvalidated free text.</w:t>
-      </w:r>
-    </w:p>
-    <w:p>
-      <w:pPr>
-        <w:pStyle w:val="Heading3Bar"/>
-      </w:pPr>
-    </w:p>
-    <w:p>
-      <w:pPr>
-        <w:pStyle w:val="Heading3"/>
-      </w:pPr>
-      <w:bookmarkStart w:id="24" w:name="_Toc241743607"/>
-      <w:r>
-        <w:t>Implementation constraints</w:t>
-      </w:r>
-      <w:bookmarkEnd w:id="24"/>
-    </w:p>
-    <w:p>
-      <w:pPr>
-        <w:pStyle w:val="Bullet1"/>
-      </w:pPr>
-      <w:r>
-        <w:t>Business rules on this platform are limited to C# 7.3.</w:t>
-      </w:r>
-    </w:p>
-    <w:p>
-      <w:pPr>
-        <w:pStyle w:val="Bullet1"/>
-      </w:pPr>
-      <w:r>
-        <w:t>Saving a rule in the Rule Manager replaces its registered data element list rather than merging it, and a lost field is indistinguishable at run time from an empty one. Verify by query after every Rule Manager change.</w:t>
-      </w:r>
-    </w:p>
-    <w:p>
-      <w:pPr>
-        <w:pStyle w:val="Bullet1"/>
-      </w:pPr>
-      <w:r>
-        <w:t>Multi-row must be selected when the registration is created; it cannot be changed afterwards.</w:t>
-      </w:r>
-    </w:p>
-    <w:p>
-      <w:pPr>
-        <w:pStyle w:val="Bullet1"/>
-      </w:pPr>
-      <w:r>
-        <w:t>The Rule Manager Test Business Rule pane cannot exercise a multi-row rule attached to a window control. The error it reports comes from its own result grid, not from the rule.</w:t>
-      </w:r>
-    </w:p>
-    <w:p>
-      <w:pPr>
-        <w:pStyle w:val="Bullet1"/>
-      </w:pPr>
-      <w:r>
-        <w:t>P21BusinessRules is refreshed from Production periodically and rule registrations are not preserved. Re-register and re-check the table after every refresh.</w:t>
-      </w:r>
-    </w:p>
-    <w:p>
-      <w:pPr>
-        <w:pStyle w:val="Bullet1"/>
-      </w:pPr>
-      <w:r>
-        <w:t>A rule description containing an apostrophe fails Rule Manager import validation.</w:t>
-      </w:r>
-    </w:p>
-    <w:p>
-      <w:pPr>
-        <w:pStyle w:val="Bullet1"/>
-      </w:pPr>
-      <w:r>
-        <w:t>Create-asi-email-context-flag.sql has not been run against Production, so the document_nos column is lost on each P21BusinessRules refresh until it is.</w:t>
-      </w:r>
-    </w:p>
-    <w:p>
-      <w:pPr>
-        <w:pStyle w:val="BodyText"/>
-      </w:pPr>
-    </w:p>
+    <w:p/>
     <w:sectPr>
-      <w:footerReference w:type="even" r:id="rId11"/>
-      <w:footerReference w:type="default" r:id="rId12"/>
-      <w:headerReference w:type="first" r:id="rId13"/>
-      <w:footerReference w:type="first" r:id="rId14"/>
+      <w:footerReference w:type="even" r:id="rId12"/>
+      <w:footerReference w:type="default" r:id="rId13"/>
+      <w:headerReference w:type="first" r:id="rId14"/>
+      <w:footerReference w:type="first" r:id="rId15"/>
       <w:pgSz w:w="12240" w:h="15840" w:code="1"/>
       <w:pgMar w:top="720" w:right="720" w:bottom="1080" w:left="720" w:header="432" w:footer="432" w:gutter="360"/>
       <w:paperSrc w:first="1" w:other="1"/>
@@ -12930,7 +12599,12 @@
 </file>
 
 <file path=customXml/item2.xml><?xml version="1.0" encoding="utf-8"?>
-<b:Sources xmlns:b="http://schemas.openxmlformats.org/officeDocument/2006/bibliography" xmlns="http://schemas.openxmlformats.org/officeDocument/2006/bibliography" SelectedStyle="\APASixthEditionOfficeOnline.xsl" StyleName="APA" Version="6"/>
+<?mso-contentType ?>
+<FormTemplates xmlns="http://schemas.microsoft.com/sharepoint/v3/contenttype/forms">
+  <Display>DocumentLibraryForm</Display>
+  <Edit>DocumentLibraryForm</Edit>
+  <New>DocumentLibraryForm</New>
+</FormTemplates>
 </file>
 
 <file path=customXml/item3.xml><?xml version="1.0" encoding="utf-8"?>
@@ -13169,12 +12843,7 @@
 </file>
 
 <file path=customXml/item4.xml><?xml version="1.0" encoding="utf-8"?>
-<?mso-contentType ?>
-<FormTemplates xmlns="http://schemas.microsoft.com/sharepoint/v3/contenttype/forms">
-  <Display>DocumentLibraryForm</Display>
-  <Edit>DocumentLibraryForm</Edit>
-  <New>DocumentLibraryForm</New>
-</FormTemplates>
+<b:Sources xmlns:b="http://schemas.openxmlformats.org/officeDocument/2006/bibliography" xmlns="http://schemas.openxmlformats.org/officeDocument/2006/bibliography" SelectedStyle="\APASixthEditionOfficeOnline.xsl" StyleName="APA" Version="6"/>
 </file>
 
 <file path=customXml/itemProps1.xml><?xml version="1.0" encoding="utf-8"?>
@@ -13189,9 +12858,9 @@
 </file>
 
 <file path=customXml/itemProps2.xml><?xml version="1.0" encoding="utf-8"?>
-<ds:datastoreItem xmlns:ds="http://schemas.openxmlformats.org/officeDocument/2006/customXml" ds:itemID="{BE081FC9-9F48-4FE4-B516-CE413520EB5D}">
+<ds:datastoreItem xmlns:ds="http://schemas.openxmlformats.org/officeDocument/2006/customXml" ds:itemID="{7AEDB33E-FFD5-40DE-8F76-B756B26645C5}">
   <ds:schemaRefs>
-    <ds:schemaRef ds:uri="http://schemas.openxmlformats.org/officeDocument/2006/bibliography"/>
+    <ds:schemaRef ds:uri="http://schemas.microsoft.com/sharepoint/v3/contenttype/forms"/>
   </ds:schemaRefs>
 </ds:datastoreItem>
 </file>
@@ -13216,9 +12885,9 @@
 </file>
 
 <file path=customXml/itemProps4.xml><?xml version="1.0" encoding="utf-8"?>
-<ds:datastoreItem xmlns:ds="http://schemas.openxmlformats.org/officeDocument/2006/customXml" ds:itemID="{7AEDB33E-FFD5-40DE-8F76-B756B26645C5}">
+<ds:datastoreItem xmlns:ds="http://schemas.openxmlformats.org/officeDocument/2006/customXml" ds:itemID="{BE081FC9-9F48-4FE4-B516-CE413520EB5D}">
   <ds:schemaRefs>
-    <ds:schemaRef ds:uri="http://schemas.microsoft.com/sharepoint/v3/contenttype/forms"/>
+    <ds:schemaRef ds:uri="http://schemas.openxmlformats.org/officeDocument/2006/bibliography"/>
   </ds:schemaRefs>
 </ds:datastoreItem>
 </file>
</xml_diff>